<commit_message>
Mission 3: rebuild summary from the recorded interviews (3 older adults, 2 family caregivers)
Co-Authored-By: Claude Opus 5 <noreply@anthropic.com>
</commit_message>
<xml_diff>
--- a/validation/ภาคผนวก-ข้อมูลผู้ให้ข้อมูล-ภารกิจ3-ส่งOIC.docx
+++ b/validation/ภาคผนวก-ข้อมูลผู้ให้ข้อมูล-ภารกิจ3-ส่งOIC.docx
@@ -34,7 +34,7 @@
           <w:szCs w:val="27"/>
           <w:lang w:bidi="th-TH"/>
         </w:rPr>
-        <w:t>ถอด​จาก​คำตอบ​จริง ใช้​รหัส​แทน​ชื่อ · ช่อง​ขีด (–) คือ​ข้อ​ที่​ไม่​ได้​ถาม · R01–R02 คือ​ลูกหลาน​ผู้ดูแล</w:t>
+        <w:t>ถอด​จาก​เสียง วิดีโอ และ​แบบสอบถาม​จริง 15–16 ก.ย. 2569 · ใช้​รหัส​แทน​ชื่อ · ขีด (–) คือ​ข้อ​ที่​ไม่​ได้​ถาม</w:t>
       </w:r>
     </w:p>
     <w:p>
@@ -54,6 +54,24 @@
         </w:rPr>
       </w:r>
     </w:p>
+    <w:p>
+      <w:pPr>
+        <w:keepNext/>
+        <w:spacing w:before="80" w:after="20" w:line="240" w:lineRule="auto"/>
+      </w:pPr>
+      <w:r>
+        <w:rPr>
+          <w:rFonts w:ascii="TH Sarabun New" w:hAnsi="TH Sarabun New" w:cs="TH Sarabun New" w:eastAsia="TH Sarabun New"/>
+          <w:b/>
+          <w:color w:val="143A74"/>
+          <w:sz w:val="30"/>
+          <w:szCs w:val="30"/>
+          <w:bCs/>
+          <w:lang w:bidi="th-TH"/>
+        </w:rPr>
+        <w:t>กลุ่มผู้สูงอายุ 3 คน</w:t>
+      </w:r>
+    </w:p>
     <w:tbl>
       <w:tblPr>
         <w:tblW w:type="auto" w:w="0"/>
@@ -70,14 +88,15 @@
         </w:tblBorders>
       </w:tblPr>
       <w:tblGrid>
-        <w:gridCol w:w="3289"/>
-        <w:gridCol w:w="3289"/>
-        <w:gridCol w:w="3289"/>
+        <w:gridCol w:w="2494"/>
+        <w:gridCol w:w="2494"/>
+        <w:gridCol w:w="2494"/>
+        <w:gridCol w:w="2494"/>
       </w:tblGrid>
       <w:tr>
         <w:tc>
           <w:tcPr>
-            <w:tcW w:type="dxa" w:w="2835"/>
+            <w:tcW w:type="dxa" w:w="1928"/>
             <w:shd w:val="clear" w:color="auto" w:fill="DCEBFB"/>
           </w:tcPr>
           <w:p>
@@ -90,8 +109,8 @@
                 <w:rFonts w:ascii="TH Sarabun New" w:hAnsi="TH Sarabun New" w:cs="TH Sarabun New" w:eastAsia="TH Sarabun New"/>
                 <w:b/>
                 <w:color w:val="143A74"/>
-                <w:sz w:val="24"/>
-                <w:szCs w:val="24"/>
+                <w:sz w:val="22"/>
+                <w:szCs w:val="22"/>
                 <w:bCs/>
                 <w:lang w:bidi="th-TH"/>
               </w:rPr>
@@ -101,7 +120,7 @@
         </w:tc>
         <w:tc>
           <w:tcPr>
-            <w:tcW w:type="dxa" w:w="3515"/>
+            <w:tcW w:type="dxa" w:w="2665"/>
             <w:shd w:val="clear" w:color="auto" w:fill="DCEBFB"/>
           </w:tcPr>
           <w:p>
@@ -114,18 +133,18 @@
                 <w:rFonts w:ascii="TH Sarabun New" w:hAnsi="TH Sarabun New" w:cs="TH Sarabun New" w:eastAsia="TH Sarabun New"/>
                 <w:b/>
                 <w:color w:val="143A74"/>
-                <w:sz w:val="24"/>
-                <w:szCs w:val="24"/>
+                <w:sz w:val="22"/>
+                <w:szCs w:val="22"/>
                 <w:bCs/>
                 <w:lang w:bidi="th-TH"/>
               </w:rPr>
-              <w:t>R01</w:t>
+              <w:t>R02</w:t>
             </w:r>
           </w:p>
         </w:tc>
         <w:tc>
           <w:tcPr>
-            <w:tcW w:type="dxa" w:w="3515"/>
+            <w:tcW w:type="dxa" w:w="2665"/>
             <w:shd w:val="clear" w:color="auto" w:fill="DCEBFB"/>
           </w:tcPr>
           <w:p>
@@ -138,20 +157,19 @@
                 <w:rFonts w:ascii="TH Sarabun New" w:hAnsi="TH Sarabun New" w:cs="TH Sarabun New" w:eastAsia="TH Sarabun New"/>
                 <w:b/>
                 <w:color w:val="143A74"/>
-                <w:sz w:val="24"/>
-                <w:szCs w:val="24"/>
+                <w:sz w:val="22"/>
+                <w:szCs w:val="22"/>
                 <w:bCs/>
                 <w:lang w:bidi="th-TH"/>
               </w:rPr>
-              <w:t>R02</w:t>
+              <w:t>R03</w:t>
             </w:r>
           </w:p>
         </w:tc>
-      </w:tr>
-      <w:tr>
         <w:tc>
           <w:tcPr>
-            <w:tcW w:type="dxa" w:w="2835"/>
+            <w:tcW w:type="dxa" w:w="2665"/>
+            <w:shd w:val="clear" w:color="auto" w:fill="DCEBFB"/>
           </w:tcPr>
           <w:p>
             <w:pPr>
@@ -162,18 +180,43 @@
               <w:rPr>
                 <w:rFonts w:ascii="TH Sarabun New" w:hAnsi="TH Sarabun New" w:cs="TH Sarabun New" w:eastAsia="TH Sarabun New"/>
                 <w:b/>
-                <w:sz w:val="24"/>
-                <w:szCs w:val="24"/>
+                <w:color w:val="143A74"/>
+                <w:sz w:val="22"/>
+                <w:szCs w:val="22"/>
                 <w:bCs/>
                 <w:lang w:bidi="th-TH"/>
               </w:rPr>
-              <w:t>วิธี​เก็บ​ข้อมูล</w:t>
+              <w:t>R04</w:t>
+            </w:r>
+          </w:p>
+        </w:tc>
+      </w:tr>
+      <w:tr>
+        <w:tc>
+          <w:tcPr>
+            <w:tcW w:type="dxa" w:w="1928"/>
+          </w:tcPr>
+          <w:p>
+            <w:pPr>
+              <w:spacing w:after="0" w:line="240" w:lineRule="auto"/>
+            </w:pPr>
+            <w:r/>
+            <w:r>
+              <w:rPr>
+                <w:rFonts w:ascii="TH Sarabun New" w:hAnsi="TH Sarabun New" w:cs="TH Sarabun New" w:eastAsia="TH Sarabun New"/>
+                <w:b/>
+                <w:sz w:val="22"/>
+                <w:szCs w:val="22"/>
+                <w:bCs/>
+                <w:lang w:bidi="th-TH"/>
+              </w:rPr>
+              <w:t>อายุ</w:t>
             </w:r>
           </w:p>
         </w:tc>
         <w:tc>
           <w:tcPr>
-            <w:tcW w:type="dxa" w:w="3515"/>
+            <w:tcW w:type="dxa" w:w="2665"/>
           </w:tcPr>
           <w:p>
             <w:pPr>
@@ -184,17 +227,17 @@
               <w:rPr>
                 <w:rFonts w:ascii="TH Sarabun New" w:hAnsi="TH Sarabun New" w:cs="TH Sarabun New" w:eastAsia="TH Sarabun New"/>
                 <w:b w:val="0"/>
-                <w:sz w:val="24"/>
-                <w:szCs w:val="24"/>
+                <w:sz w:val="22"/>
+                <w:szCs w:val="22"/>
                 <w:lang w:bidi="th-TH"/>
               </w:rPr>
-              <w:t>แบบสอบถาม​ตอบ​เอง</w:t>
+              <w:t>60 ปี</w:t>
             </w:r>
           </w:p>
         </w:tc>
         <w:tc>
           <w:tcPr>
-            <w:tcW w:type="dxa" w:w="3515"/>
+            <w:tcW w:type="dxa" w:w="2665"/>
           </w:tcPr>
           <w:p>
             <w:pPr>
@@ -205,11 +248,32 @@
               <w:rPr>
                 <w:rFonts w:ascii="TH Sarabun New" w:hAnsi="TH Sarabun New" w:cs="TH Sarabun New" w:eastAsia="TH Sarabun New"/>
                 <w:b w:val="0"/>
-                <w:sz w:val="24"/>
-                <w:szCs w:val="24"/>
+                <w:sz w:val="22"/>
+                <w:szCs w:val="22"/>
                 <w:lang w:bidi="th-TH"/>
               </w:rPr>
-              <w:t>สัมภาษณ์​ตัวต่อตัว</w:t>
+              <w:t>68 ปี</w:t>
+            </w:r>
+          </w:p>
+        </w:tc>
+        <w:tc>
+          <w:tcPr>
+            <w:tcW w:type="dxa" w:w="2665"/>
+          </w:tcPr>
+          <w:p>
+            <w:pPr>
+              <w:spacing w:after="0" w:line="240" w:lineRule="auto"/>
+            </w:pPr>
+            <w:r/>
+            <w:r>
+              <w:rPr>
+                <w:rFonts w:ascii="TH Sarabun New" w:hAnsi="TH Sarabun New" w:cs="TH Sarabun New" w:eastAsia="TH Sarabun New"/>
+                <w:b w:val="0"/>
+                <w:sz w:val="22"/>
+                <w:szCs w:val="22"/>
+                <w:lang w:bidi="th-TH"/>
+              </w:rPr>
+              <w:t>65 ปี</w:t>
             </w:r>
           </w:p>
         </w:tc>
@@ -217,7 +281,7 @@
       <w:tr>
         <w:tc>
           <w:tcPr>
-            <w:tcW w:type="dxa" w:w="2835"/>
+            <w:tcW w:type="dxa" w:w="1928"/>
           </w:tcPr>
           <w:p>
             <w:pPr>
@@ -228,18 +292,18 @@
               <w:rPr>
                 <w:rFonts w:ascii="TH Sarabun New" w:hAnsi="TH Sarabun New" w:cs="TH Sarabun New" w:eastAsia="TH Sarabun New"/>
                 <w:b/>
-                <w:sz w:val="24"/>
-                <w:szCs w:val="24"/>
+                <w:sz w:val="22"/>
+                <w:szCs w:val="22"/>
                 <w:bCs/>
                 <w:lang w:bidi="th-TH"/>
               </w:rPr>
-              <w:t>อายุ​พ่อ​หรือ​แม่</w:t>
+              <w:t>วิธี​เก็บ​ข้อมูล</w:t>
             </w:r>
           </w:p>
         </w:tc>
         <w:tc>
           <w:tcPr>
-            <w:tcW w:type="dxa" w:w="3515"/>
+            <w:tcW w:type="dxa" w:w="2665"/>
           </w:tcPr>
           <w:p>
             <w:pPr>
@@ -250,17 +314,17 @@
               <w:rPr>
                 <w:rFonts w:ascii="TH Sarabun New" w:hAnsi="TH Sarabun New" w:cs="TH Sarabun New" w:eastAsia="TH Sarabun New"/>
                 <w:b w:val="0"/>
-                <w:sz w:val="24"/>
-                <w:szCs w:val="24"/>
+                <w:sz w:val="22"/>
+                <w:szCs w:val="22"/>
                 <w:lang w:bidi="th-TH"/>
               </w:rPr>
-              <w:t>ประมาณ 75 ปี</w:t>
+              <w:t>สัมภาษณ์ บันทึกเสียง</w:t>
             </w:r>
           </w:p>
         </w:tc>
         <w:tc>
           <w:tcPr>
-            <w:tcW w:type="dxa" w:w="3515"/>
+            <w:tcW w:type="dxa" w:w="2665"/>
           </w:tcPr>
           <w:p>
             <w:pPr>
@@ -271,11 +335,32 @@
               <w:rPr>
                 <w:rFonts w:ascii="TH Sarabun New" w:hAnsi="TH Sarabun New" w:cs="TH Sarabun New" w:eastAsia="TH Sarabun New"/>
                 <w:b w:val="0"/>
-                <w:sz w:val="24"/>
-                <w:szCs w:val="24"/>
+                <w:sz w:val="22"/>
+                <w:szCs w:val="22"/>
                 <w:lang w:bidi="th-TH"/>
               </w:rPr>
-              <w:t>ประมาณ 76 ปี</w:t>
+              <w:t>สัมภาษณ์ บันทึกเสียง</w:t>
+            </w:r>
+          </w:p>
+        </w:tc>
+        <w:tc>
+          <w:tcPr>
+            <w:tcW w:type="dxa" w:w="2665"/>
+          </w:tcPr>
+          <w:p>
+            <w:pPr>
+              <w:spacing w:after="0" w:line="240" w:lineRule="auto"/>
+            </w:pPr>
+            <w:r/>
+            <w:r>
+              <w:rPr>
+                <w:rFonts w:ascii="TH Sarabun New" w:hAnsi="TH Sarabun New" w:cs="TH Sarabun New" w:eastAsia="TH Sarabun New"/>
+                <w:b w:val="0"/>
+                <w:sz w:val="22"/>
+                <w:szCs w:val="22"/>
+                <w:lang w:bidi="th-TH"/>
+              </w:rPr>
+              <w:t>สัมภาษณ์ บันทึกเสียง​และ​วิดีโอ​ไม่​เห็น​หน้า</w:t>
             </w:r>
           </w:p>
         </w:tc>
@@ -283,7 +368,7 @@
       <w:tr>
         <w:tc>
           <w:tcPr>
-            <w:tcW w:type="dxa" w:w="2835"/>
+            <w:tcW w:type="dxa" w:w="1928"/>
           </w:tcPr>
           <w:p>
             <w:pPr>
@@ -294,18 +379,18 @@
               <w:rPr>
                 <w:rFonts w:ascii="TH Sarabun New" w:hAnsi="TH Sarabun New" w:cs="TH Sarabun New" w:eastAsia="TH Sarabun New"/>
                 <w:b/>
-                <w:sz w:val="24"/>
-                <w:szCs w:val="24"/>
+                <w:sz w:val="22"/>
+                <w:szCs w:val="22"/>
                 <w:bCs/>
                 <w:lang w:bidi="th-TH"/>
               </w:rPr>
-              <w:t>การอยู่อาศัย</w:t>
+              <w:t>งาน​ที่​ต้อง​ใช้​แรง</w:t>
             </w:r>
           </w:p>
         </w:tc>
         <w:tc>
           <w:tcPr>
-            <w:tcW w:type="dxa" w:w="3515"/>
+            <w:tcW w:type="dxa" w:w="2665"/>
           </w:tcPr>
           <w:p>
             <w:pPr>
@@ -316,17 +401,17 @@
               <w:rPr>
                 <w:rFonts w:ascii="TH Sarabun New" w:hAnsi="TH Sarabun New" w:cs="TH Sarabun New" w:eastAsia="TH Sarabun New"/>
                 <w:b w:val="0"/>
-                <w:sz w:val="24"/>
-                <w:szCs w:val="24"/>
+                <w:sz w:val="22"/>
+                <w:szCs w:val="22"/>
                 <w:lang w:bidi="th-TH"/>
               </w:rPr>
-              <w:t>–</w:t>
+              <w:t>ยก​ของขึ้น​บันได​อาคาร 4 ชั้น</w:t>
             </w:r>
           </w:p>
         </w:tc>
         <w:tc>
           <w:tcPr>
-            <w:tcW w:type="dxa" w:w="3515"/>
+            <w:tcW w:type="dxa" w:w="2665"/>
           </w:tcPr>
           <w:p>
             <w:pPr>
@@ -337,11 +422,32 @@
               <w:rPr>
                 <w:rFonts w:ascii="TH Sarabun New" w:hAnsi="TH Sarabun New" w:cs="TH Sarabun New" w:eastAsia="TH Sarabun New"/>
                 <w:b w:val="0"/>
-                <w:sz w:val="24"/>
-                <w:szCs w:val="24"/>
+                <w:sz w:val="22"/>
+                <w:szCs w:val="22"/>
                 <w:lang w:bidi="th-TH"/>
               </w:rPr>
-              <w:t>อยู่​บ้าน​เดียวกัน</w:t>
+              <w:t>ขึ้น​ลง​อาคาร 3 ชั้น วัน​ละ 3 รอบ และ​ยก​ขยะ​ลง​บันได</w:t>
+            </w:r>
+          </w:p>
+        </w:tc>
+        <w:tc>
+          <w:tcPr>
+            <w:tcW w:type="dxa" w:w="2665"/>
+          </w:tcPr>
+          <w:p>
+            <w:pPr>
+              <w:spacing w:after="0" w:line="240" w:lineRule="auto"/>
+            </w:pPr>
+            <w:r/>
+            <w:r>
+              <w:rPr>
+                <w:rFonts w:ascii="TH Sarabun New" w:hAnsi="TH Sarabun New" w:cs="TH Sarabun New" w:eastAsia="TH Sarabun New"/>
+                <w:b w:val="0"/>
+                <w:sz w:val="22"/>
+                <w:szCs w:val="22"/>
+                <w:lang w:bidi="th-TH"/>
+              </w:rPr>
+              <w:t>ขึ้น​ลง​บันได​หนึ่ง​ชั้น วัน​ละ 2–3 รอบ ยก​ของ​ตาม​งาน</w:t>
             </w:r>
           </w:p>
         </w:tc>
@@ -349,7 +455,7 @@
       <w:tr>
         <w:tc>
           <w:tcPr>
-            <w:tcW w:type="dxa" w:w="2835"/>
+            <w:tcW w:type="dxa" w:w="1928"/>
           </w:tcPr>
           <w:p>
             <w:pPr>
@@ -360,18 +466,18 @@
               <w:rPr>
                 <w:rFonts w:ascii="TH Sarabun New" w:hAnsi="TH Sarabun New" w:cs="TH Sarabun New" w:eastAsia="TH Sarabun New"/>
                 <w:b/>
-                <w:sz w:val="24"/>
-                <w:szCs w:val="24"/>
+                <w:sz w:val="22"/>
+                <w:szCs w:val="22"/>
                 <w:bCs/>
                 <w:lang w:bidi="th-TH"/>
               </w:rPr>
-              <w:t>ชีวิตประจำวัน​ของ​พ่อแม่</w:t>
+              <w:t>การ​หกล้ม​ใน​ปี​นี้</w:t>
             </w:r>
           </w:p>
         </w:tc>
         <w:tc>
           <w:tcPr>
-            <w:tcW w:type="dxa" w:w="3515"/>
+            <w:tcW w:type="dxa" w:w="2665"/>
           </w:tcPr>
           <w:p>
             <w:pPr>
@@ -382,17 +488,17 @@
               <w:rPr>
                 <w:rFonts w:ascii="TH Sarabun New" w:hAnsi="TH Sarabun New" w:cs="TH Sarabun New" w:eastAsia="TH Sarabun New"/>
                 <w:b w:val="0"/>
-                <w:sz w:val="24"/>
-                <w:szCs w:val="24"/>
+                <w:sz w:val="22"/>
+                <w:szCs w:val="22"/>
                 <w:lang w:bidi="th-TH"/>
               </w:rPr>
-              <w:t>–</w:t>
+              <w:t>ล้ม​หลายครั้ง​จน​นับ​ไม่​ได้ เช่น รองเท้า​พลิก​ตก​บันได​หนึ่ง​ช่วง ลื่น​พื้น​เปียก​ตอน​ฝนตก ล้ม​บน​ฟุตบาท​เมื่อ​สัปดาห์​ก่อน และ​สะดุด​ตอน​ตีห้า​ครึ่ง​เพราะ​มองไม่เห็น ต้อง​มี​คน​ช่วย​พยุง</w:t>
             </w:r>
           </w:p>
         </w:tc>
         <w:tc>
           <w:tcPr>
-            <w:tcW w:type="dxa" w:w="3515"/>
+            <w:tcW w:type="dxa" w:w="2665"/>
           </w:tcPr>
           <w:p>
             <w:pPr>
@@ -403,11 +509,32 @@
               <w:rPr>
                 <w:rFonts w:ascii="TH Sarabun New" w:hAnsi="TH Sarabun New" w:cs="TH Sarabun New" w:eastAsia="TH Sarabun New"/>
                 <w:b w:val="0"/>
-                <w:sz w:val="24"/>
-                <w:szCs w:val="24"/>
+                <w:sz w:val="22"/>
+                <w:szCs w:val="22"/>
                 <w:lang w:bidi="th-TH"/>
               </w:rPr>
-              <w:t>สุขภาพ​ไม่​แข็งแรง มี​โรคประจำตัว เวลา​อยากรู้​อาการ​จะ​โทร​ถาม​พ่อแม่</w:t>
+              <w:t>ปี​นี้​ล้ม​แล้ว 2 ครั้ง</w:t>
+            </w:r>
+          </w:p>
+        </w:tc>
+        <w:tc>
+          <w:tcPr>
+            <w:tcW w:type="dxa" w:w="2665"/>
+          </w:tcPr>
+          <w:p>
+            <w:pPr>
+              <w:spacing w:after="0" w:line="240" w:lineRule="auto"/>
+            </w:pPr>
+            <w:r/>
+            <w:r>
+              <w:rPr>
+                <w:rFonts w:ascii="TH Sarabun New" w:hAnsi="TH Sarabun New" w:cs="TH Sarabun New" w:eastAsia="TH Sarabun New"/>
+                <w:b w:val="0"/>
+                <w:sz w:val="22"/>
+                <w:szCs w:val="22"/>
+                <w:lang w:bidi="th-TH"/>
+              </w:rPr>
+              <w:t>ปี​นี้​ล้ม​แล้ว 3 ครั้งหน้า​อาคาร​ใน​ที่ทำงาน หัวเข่า​กระแทก​จน​แตก</w:t>
             </w:r>
           </w:p>
         </w:tc>
@@ -415,7 +542,7 @@
       <w:tr>
         <w:tc>
           <w:tcPr>
-            <w:tcW w:type="dxa" w:w="2835"/>
+            <w:tcW w:type="dxa" w:w="1928"/>
           </w:tcPr>
           <w:p>
             <w:pPr>
@@ -426,18 +553,18 @@
               <w:rPr>
                 <w:rFonts w:ascii="TH Sarabun New" w:hAnsi="TH Sarabun New" w:cs="TH Sarabun New" w:eastAsia="TH Sarabun New"/>
                 <w:b/>
-                <w:sz w:val="24"/>
-                <w:szCs w:val="24"/>
+                <w:sz w:val="22"/>
+                <w:szCs w:val="22"/>
                 <w:bCs/>
                 <w:lang w:bidi="th-TH"/>
               </w:rPr>
-              <w:t>ล้ม​หรือ​เกือบ​ล้ม​ใน​หนึ่ง​ปี</w:t>
+              <w:t>สิ่ง​ที่​ทำได้​ยาก​ขึ้น</w:t>
             </w:r>
           </w:p>
         </w:tc>
         <w:tc>
           <w:tcPr>
-            <w:tcW w:type="dxa" w:w="3515"/>
+            <w:tcW w:type="dxa" w:w="2665"/>
           </w:tcPr>
           <w:p>
             <w:pPr>
@@ -448,17 +575,17 @@
               <w:rPr>
                 <w:rFonts w:ascii="TH Sarabun New" w:hAnsi="TH Sarabun New" w:cs="TH Sarabun New" w:eastAsia="TH Sarabun New"/>
                 <w:b w:val="0"/>
-                <w:sz w:val="24"/>
-                <w:szCs w:val="24"/>
+                <w:sz w:val="22"/>
+                <w:szCs w:val="22"/>
                 <w:lang w:bidi="th-TH"/>
               </w:rPr>
-              <w:t>ตอบ​ว่า เคย (​ข้อ​คำถาม​รวม​ล้ม​และ​เกือบ​ล้ม​)</w:t>
+              <w:t>นั่ง​ยอง​ไม่​ได้​แล้ว ต้อง​ใช้​ชักโครก · ขึ้น​บันได​ยาก​ขึ้น</w:t>
             </w:r>
           </w:p>
         </w:tc>
         <w:tc>
           <w:tcPr>
-            <w:tcW w:type="dxa" w:w="3515"/>
+            <w:tcW w:type="dxa" w:w="2665"/>
           </w:tcPr>
           <w:p>
             <w:pPr>
@@ -469,11 +596,32 @@
               <w:rPr>
                 <w:rFonts w:ascii="TH Sarabun New" w:hAnsi="TH Sarabun New" w:cs="TH Sarabun New" w:eastAsia="TH Sarabun New"/>
                 <w:b w:val="0"/>
-                <w:sz w:val="24"/>
-                <w:szCs w:val="24"/>
+                <w:sz w:val="22"/>
+                <w:szCs w:val="22"/>
                 <w:lang w:bidi="th-TH"/>
               </w:rPr>
-              <w:t>คุณพ่อ​เคย​ล้ม​ประมาณ 3 ครั้ง เมื่อ​ต้นปี 2569</w:t>
+              <w:t>นั่ง​ยอง​แล้ว​ลุก​ยาก​ขึ้น ขึ้น​บันได​ยัง​ปกติ</w:t>
+            </w:r>
+          </w:p>
+        </w:tc>
+        <w:tc>
+          <w:tcPr>
+            <w:tcW w:type="dxa" w:w="2665"/>
+          </w:tcPr>
+          <w:p>
+            <w:pPr>
+              <w:spacing w:after="0" w:line="240" w:lineRule="auto"/>
+            </w:pPr>
+            <w:r/>
+            <w:r>
+              <w:rPr>
+                <w:rFonts w:ascii="TH Sarabun New" w:hAnsi="TH Sarabun New" w:cs="TH Sarabun New" w:eastAsia="TH Sarabun New"/>
+                <w:b w:val="0"/>
+                <w:sz w:val="22"/>
+                <w:szCs w:val="22"/>
+                <w:lang w:bidi="th-TH"/>
+              </w:rPr>
+              <w:t>นั่ง​ยอง​ไม่​ได้​เพราะ​เข่า​เสื่อม · ขึ้น​บันได​ได้​แต่​ช้า​และ​ไม่​กล้า​รีบ</w:t>
             </w:r>
           </w:p>
         </w:tc>
@@ -481,7 +629,7 @@
       <w:tr>
         <w:tc>
           <w:tcPr>
-            <w:tcW w:type="dxa" w:w="2835"/>
+            <w:tcW w:type="dxa" w:w="1928"/>
           </w:tcPr>
           <w:p>
             <w:pPr>
@@ -492,18 +640,18 @@
               <w:rPr>
                 <w:rFonts w:ascii="TH Sarabun New" w:hAnsi="TH Sarabun New" w:cs="TH Sarabun New" w:eastAsia="TH Sarabun New"/>
                 <w:b/>
-                <w:sz w:val="24"/>
-                <w:szCs w:val="24"/>
+                <w:sz w:val="22"/>
+                <w:szCs w:val="22"/>
                 <w:bCs/>
                 <w:lang w:bidi="th-TH"/>
               </w:rPr>
-              <w:t>เคย​ถู​กวัด​การทรงตัว​หรือ​กำลัง​ขา</w:t>
+              <w:t>การ​ตรวจ​สุขภาพ</w:t>
             </w:r>
           </w:p>
         </w:tc>
         <w:tc>
           <w:tcPr>
-            <w:tcW w:type="dxa" w:w="3515"/>
+            <w:tcW w:type="dxa" w:w="2665"/>
           </w:tcPr>
           <w:p>
             <w:pPr>
@@ -514,17 +662,17 @@
               <w:rPr>
                 <w:rFonts w:ascii="TH Sarabun New" w:hAnsi="TH Sarabun New" w:cs="TH Sarabun New" w:eastAsia="TH Sarabun New"/>
                 <w:b w:val="0"/>
-                <w:sz w:val="24"/>
-                <w:szCs w:val="24"/>
+                <w:sz w:val="22"/>
+                <w:szCs w:val="22"/>
                 <w:lang w:bidi="th-TH"/>
               </w:rPr>
-              <w:t>ไม่​เคย</w:t>
+              <w:t>ไม่​เคย​ตรวจ​สุขภาพ​ประจำปี ไป​พบ​แพทย์​เฉพาะ​ตาม​นัด​รับ​ยา</w:t>
             </w:r>
           </w:p>
         </w:tc>
         <w:tc>
           <w:tcPr>
-            <w:tcW w:type="dxa" w:w="3515"/>
+            <w:tcW w:type="dxa" w:w="2665"/>
           </w:tcPr>
           <w:p>
             <w:pPr>
@@ -535,11 +683,32 @@
               <w:rPr>
                 <w:rFonts w:ascii="TH Sarabun New" w:hAnsi="TH Sarabun New" w:cs="TH Sarabun New" w:eastAsia="TH Sarabun New"/>
                 <w:b w:val="0"/>
-                <w:sz w:val="24"/>
-                <w:szCs w:val="24"/>
+                <w:sz w:val="22"/>
+                <w:szCs w:val="22"/>
                 <w:lang w:bidi="th-TH"/>
               </w:rPr>
-              <w:t>ไม่​เคย</w:t>
+              <w:t>พบ​แพทย์​ตาม​นัด​เมื่อ 15 ก.ย. ความดัน​ปกติ</w:t>
+            </w:r>
+          </w:p>
+        </w:tc>
+        <w:tc>
+          <w:tcPr>
+            <w:tcW w:type="dxa" w:w="2665"/>
+          </w:tcPr>
+          <w:p>
+            <w:pPr>
+              <w:spacing w:after="0" w:line="240" w:lineRule="auto"/>
+            </w:pPr>
+            <w:r/>
+            <w:r>
+              <w:rPr>
+                <w:rFonts w:ascii="TH Sarabun New" w:hAnsi="TH Sarabun New" w:cs="TH Sarabun New" w:eastAsia="TH Sarabun New"/>
+                <w:b w:val="0"/>
+                <w:sz w:val="22"/>
+                <w:szCs w:val="22"/>
+                <w:lang w:bidi="th-TH"/>
+              </w:rPr>
+              <w:t>ตรวจเลือด​ตาม​นัด​ทุก 4 เดือน นัด​ถัดไป 22 ก.ย.</w:t>
             </w:r>
           </w:p>
         </w:tc>
@@ -547,7 +716,7 @@
       <w:tr>
         <w:tc>
           <w:tcPr>
-            <w:tcW w:type="dxa" w:w="2835"/>
+            <w:tcW w:type="dxa" w:w="1928"/>
           </w:tcPr>
           <w:p>
             <w:pPr>
@@ -558,18 +727,18 @@
               <w:rPr>
                 <w:rFonts w:ascii="TH Sarabun New" w:hAnsi="TH Sarabun New" w:cs="TH Sarabun New" w:eastAsia="TH Sarabun New"/>
                 <w:b/>
-                <w:sz w:val="24"/>
-                <w:szCs w:val="24"/>
+                <w:sz w:val="22"/>
+                <w:szCs w:val="22"/>
                 <w:bCs/>
                 <w:lang w:bidi="th-TH"/>
               </w:rPr>
-              <w:t>ความกังวล​เรื่อง​การล้ม</w:t>
+              <w:t>ความกังวล</w:t>
             </w:r>
           </w:p>
         </w:tc>
         <w:tc>
           <w:tcPr>
-            <w:tcW w:type="dxa" w:w="3515"/>
+            <w:tcW w:type="dxa" w:w="2665"/>
           </w:tcPr>
           <w:p>
             <w:pPr>
@@ -580,17 +749,17 @@
               <w:rPr>
                 <w:rFonts w:ascii="TH Sarabun New" w:hAnsi="TH Sarabun New" w:cs="TH Sarabun New" w:eastAsia="TH Sarabun New"/>
                 <w:b w:val="0"/>
-                <w:sz w:val="24"/>
-                <w:szCs w:val="24"/>
+                <w:sz w:val="22"/>
+                <w:szCs w:val="22"/>
                 <w:lang w:bidi="th-TH"/>
               </w:rPr>
-              <w:t>กังวล​มาก</w:t>
+              <w:t>กลัว​การล้ม​จน​ติด​เตียง​มาก</w:t>
             </w:r>
           </w:p>
         </w:tc>
         <w:tc>
           <w:tcPr>
-            <w:tcW w:type="dxa" w:w="3515"/>
+            <w:tcW w:type="dxa" w:w="2665"/>
           </w:tcPr>
           <w:p>
             <w:pPr>
@@ -601,11 +770,32 @@
               <w:rPr>
                 <w:rFonts w:ascii="TH Sarabun New" w:hAnsi="TH Sarabun New" w:cs="TH Sarabun New" w:eastAsia="TH Sarabun New"/>
                 <w:b w:val="0"/>
-                <w:sz w:val="24"/>
-                <w:szCs w:val="24"/>
+                <w:sz w:val="22"/>
+                <w:szCs w:val="22"/>
                 <w:lang w:bidi="th-TH"/>
               </w:rPr>
-              <w:t>–</w:t>
+              <w:t>คิดมาก​และ​กลัว​การล้ม​จน​ติด​เตียง</w:t>
+            </w:r>
+          </w:p>
+        </w:tc>
+        <w:tc>
+          <w:tcPr>
+            <w:tcW w:type="dxa" w:w="2665"/>
+          </w:tcPr>
+          <w:p>
+            <w:pPr>
+              <w:spacing w:after="0" w:line="240" w:lineRule="auto"/>
+            </w:pPr>
+            <w:r/>
+            <w:r>
+              <w:rPr>
+                <w:rFonts w:ascii="TH Sarabun New" w:hAnsi="TH Sarabun New" w:cs="TH Sarabun New" w:eastAsia="TH Sarabun New"/>
+                <w:b w:val="0"/>
+                <w:sz w:val="22"/>
+                <w:szCs w:val="22"/>
+                <w:lang w:bidi="th-TH"/>
+              </w:rPr>
+              <w:t>ห่วง​กรณี​ล้ม​แล้ว​ลุก​เอง​ไม่​ได้</w:t>
             </w:r>
           </w:p>
         </w:tc>
@@ -613,7 +803,7 @@
       <w:tr>
         <w:tc>
           <w:tcPr>
-            <w:tcW w:type="dxa" w:w="2835"/>
+            <w:tcW w:type="dxa" w:w="1928"/>
           </w:tcPr>
           <w:p>
             <w:pPr>
@@ -624,18 +814,18 @@
               <w:rPr>
                 <w:rFonts w:ascii="TH Sarabun New" w:hAnsi="TH Sarabun New" w:cs="TH Sarabun New" w:eastAsia="TH Sarabun New"/>
                 <w:b/>
-                <w:sz w:val="24"/>
-                <w:szCs w:val="24"/>
+                <w:sz w:val="22"/>
+                <w:szCs w:val="22"/>
                 <w:bCs/>
                 <w:lang w:bidi="th-TH"/>
               </w:rPr>
-              <w:t>การ​ติดตั้ง​แอ​ป</w:t>
+              <w:t>ถ้า​รู้​ว่า​เสี่ยง จะ​ทำ​อะไร</w:t>
             </w:r>
           </w:p>
         </w:tc>
         <w:tc>
           <w:tcPr>
-            <w:tcW w:type="dxa" w:w="3515"/>
+            <w:tcW w:type="dxa" w:w="2665"/>
           </w:tcPr>
           <w:p>
             <w:pPr>
@@ -646,17 +836,17 @@
               <w:rPr>
                 <w:rFonts w:ascii="TH Sarabun New" w:hAnsi="TH Sarabun New" w:cs="TH Sarabun New" w:eastAsia="TH Sarabun New"/>
                 <w:b w:val="0"/>
-                <w:sz w:val="24"/>
-                <w:szCs w:val="24"/>
+                <w:sz w:val="22"/>
+                <w:szCs w:val="22"/>
                 <w:lang w:bidi="th-TH"/>
               </w:rPr>
-              <w:t>ต้อง​มี​คน​ช่วย</w:t>
+              <w:t>–</w:t>
             </w:r>
           </w:p>
         </w:tc>
         <w:tc>
           <w:tcPr>
-            <w:tcW w:type="dxa" w:w="3515"/>
+            <w:tcW w:type="dxa" w:w="2665"/>
           </w:tcPr>
           <w:p>
             <w:pPr>
@@ -667,11 +857,32 @@
               <w:rPr>
                 <w:rFonts w:ascii="TH Sarabun New" w:hAnsi="TH Sarabun New" w:cs="TH Sarabun New" w:eastAsia="TH Sarabun New"/>
                 <w:b w:val="0"/>
-                <w:sz w:val="24"/>
-                <w:szCs w:val="24"/>
+                <w:sz w:val="22"/>
+                <w:szCs w:val="22"/>
                 <w:lang w:bidi="th-TH"/>
               </w:rPr>
               <w:t>–</w:t>
+            </w:r>
+          </w:p>
+        </w:tc>
+        <w:tc>
+          <w:tcPr>
+            <w:tcW w:type="dxa" w:w="2665"/>
+          </w:tcPr>
+          <w:p>
+            <w:pPr>
+              <w:spacing w:after="0" w:line="240" w:lineRule="auto"/>
+            </w:pPr>
+            <w:r/>
+            <w:r>
+              <w:rPr>
+                <w:rFonts w:ascii="TH Sarabun New" w:hAnsi="TH Sarabun New" w:cs="TH Sarabun New" w:eastAsia="TH Sarabun New"/>
+                <w:b w:val="0"/>
+                <w:sz w:val="22"/>
+                <w:szCs w:val="22"/>
+                <w:lang w:bidi="th-TH"/>
+              </w:rPr>
+              <w:t>จะ​ทำ​กายภาพ​เพื่อ​ป้องกัน​การล้ม และ​ตื่น​เช้า​จะ​ค่อย ๆ ลุก</w:t>
             </w:r>
           </w:p>
         </w:tc>
@@ -679,7 +890,7 @@
       <w:tr>
         <w:tc>
           <w:tcPr>
-            <w:tcW w:type="dxa" w:w="2835"/>
+            <w:tcW w:type="dxa" w:w="1928"/>
           </w:tcPr>
           <w:p>
             <w:pPr>
@@ -690,18 +901,18 @@
               <w:rPr>
                 <w:rFonts w:ascii="TH Sarabun New" w:hAnsi="TH Sarabun New" w:cs="TH Sarabun New" w:eastAsia="TH Sarabun New"/>
                 <w:b/>
-                <w:sz w:val="24"/>
-                <w:szCs w:val="24"/>
+                <w:sz w:val="22"/>
+                <w:szCs w:val="22"/>
                 <w:bCs/>
                 <w:lang w:bidi="th-TH"/>
               </w:rPr>
-              <w:t>ใช้เวลา​หรือ​เงิน​กับ​เรื่อง​นี้</w:t>
+              <w:t>การ​ใช้​แอ​ป</w:t>
             </w:r>
           </w:p>
         </w:tc>
         <w:tc>
           <w:tcPr>
-            <w:tcW w:type="dxa" w:w="3515"/>
+            <w:tcW w:type="dxa" w:w="2665"/>
           </w:tcPr>
           <w:p>
             <w:pPr>
@@ -712,17 +923,17 @@
               <w:rPr>
                 <w:rFonts w:ascii="TH Sarabun New" w:hAnsi="TH Sarabun New" w:cs="TH Sarabun New" w:eastAsia="TH Sarabun New"/>
                 <w:b w:val="0"/>
-                <w:sz w:val="24"/>
-                <w:szCs w:val="24"/>
+                <w:sz w:val="22"/>
+                <w:szCs w:val="22"/>
                 <w:lang w:bidi="th-TH"/>
               </w:rPr>
-              <w:t>–</w:t>
+              <w:t>ใช้​แอ​ป​ไม่​เป็น เพิ่ง​เริ่ม​แตะ​หน้าจอ​เป็น</w:t>
             </w:r>
           </w:p>
         </w:tc>
         <w:tc>
           <w:tcPr>
-            <w:tcW w:type="dxa" w:w="3515"/>
+            <w:tcW w:type="dxa" w:w="2665"/>
           </w:tcPr>
           <w:p>
             <w:pPr>
@@ -733,11 +944,32 @@
               <w:rPr>
                 <w:rFonts w:ascii="TH Sarabun New" w:hAnsi="TH Sarabun New" w:cs="TH Sarabun New" w:eastAsia="TH Sarabun New"/>
                 <w:b w:val="0"/>
-                <w:sz w:val="24"/>
-                <w:szCs w:val="24"/>
+                <w:sz w:val="22"/>
+                <w:szCs w:val="22"/>
                 <w:lang w:bidi="th-TH"/>
               </w:rPr>
-              <w:t>เวลา​และ​เงิน​ค่ารักษา และ​ยาบำรุง</w:t>
+              <w:t>ครู​เป็น​คน​ลง​แอ​ป​ให้ ยัง​กด​ใช้​ไม่​ถูก</w:t>
+            </w:r>
+          </w:p>
+        </w:tc>
+        <w:tc>
+          <w:tcPr>
+            <w:tcW w:type="dxa" w:w="2665"/>
+          </w:tcPr>
+          <w:p>
+            <w:pPr>
+              <w:spacing w:after="0" w:line="240" w:lineRule="auto"/>
+            </w:pPr>
+            <w:r/>
+            <w:r>
+              <w:rPr>
+                <w:rFonts w:ascii="TH Sarabun New" w:hAnsi="TH Sarabun New" w:cs="TH Sarabun New" w:eastAsia="TH Sarabun New"/>
+                <w:b w:val="0"/>
+                <w:sz w:val="22"/>
+                <w:szCs w:val="22"/>
+                <w:lang w:bidi="th-TH"/>
+              </w:rPr>
+              <w:t>ลูก​เป็น​คน​ลง​แอ​ป​ให้ ใช้​ดู​ข้อมูล​ได้</w:t>
             </w:r>
           </w:p>
         </w:tc>
@@ -745,7 +977,7 @@
       <w:tr>
         <w:tc>
           <w:tcPr>
-            <w:tcW w:type="dxa" w:w="2835"/>
+            <w:tcW w:type="dxa" w:w="1928"/>
           </w:tcPr>
           <w:p>
             <w:pPr>
@@ -756,18 +988,18 @@
               <w:rPr>
                 <w:rFonts w:ascii="TH Sarabun New" w:hAnsi="TH Sarabun New" w:cs="TH Sarabun New" w:eastAsia="TH Sarabun New"/>
                 <w:b/>
-                <w:sz w:val="24"/>
-                <w:szCs w:val="24"/>
+                <w:sz w:val="22"/>
+                <w:szCs w:val="22"/>
                 <w:bCs/>
                 <w:lang w:bidi="th-TH"/>
               </w:rPr>
-              <w:t>ถ้า​ได้​ข้อความ​ว่า​ผล​แย่​ลง จะ​ทำ​อะไร</w:t>
+              <w:t>ถ้า​ล้ม​ที่​บ้าน ใคร​รู้​ก่อน</w:t>
             </w:r>
           </w:p>
         </w:tc>
         <w:tc>
           <w:tcPr>
-            <w:tcW w:type="dxa" w:w="3515"/>
+            <w:tcW w:type="dxa" w:w="2665"/>
           </w:tcPr>
           <w:p>
             <w:pPr>
@@ -778,17 +1010,17 @@
               <w:rPr>
                 <w:rFonts w:ascii="TH Sarabun New" w:hAnsi="TH Sarabun New" w:cs="TH Sarabun New" w:eastAsia="TH Sarabun New"/>
                 <w:b w:val="0"/>
-                <w:sz w:val="24"/>
-                <w:szCs w:val="24"/>
+                <w:sz w:val="22"/>
+                <w:szCs w:val="22"/>
                 <w:lang w:bidi="th-TH"/>
               </w:rPr>
-              <w:t>–</w:t>
+              <w:t>ลูกสาว โดย​ต้อง​ร้องเรียก</w:t>
             </w:r>
           </w:p>
         </w:tc>
         <w:tc>
           <w:tcPr>
-            <w:tcW w:type="dxa" w:w="3515"/>
+            <w:tcW w:type="dxa" w:w="2665"/>
           </w:tcPr>
           <w:p>
             <w:pPr>
@@ -799,11 +1031,32 @@
               <w:rPr>
                 <w:rFonts w:ascii="TH Sarabun New" w:hAnsi="TH Sarabun New" w:cs="TH Sarabun New" w:eastAsia="TH Sarabun New"/>
                 <w:b w:val="0"/>
-                <w:sz w:val="24"/>
-                <w:szCs w:val="24"/>
+                <w:sz w:val="22"/>
+                <w:szCs w:val="22"/>
                 <w:lang w:bidi="th-TH"/>
               </w:rPr>
-              <w:t>พา​ไป​พบ​แพทย์</w:t>
+              <w:t>หลาน​ที่อยู่​ด้วย</w:t>
+            </w:r>
+          </w:p>
+        </w:tc>
+        <w:tc>
+          <w:tcPr>
+            <w:tcW w:type="dxa" w:w="2665"/>
+          </w:tcPr>
+          <w:p>
+            <w:pPr>
+              <w:spacing w:after="0" w:line="240" w:lineRule="auto"/>
+            </w:pPr>
+            <w:r/>
+            <w:r>
+              <w:rPr>
+                <w:rFonts w:ascii="TH Sarabun New" w:hAnsi="TH Sarabun New" w:cs="TH Sarabun New" w:eastAsia="TH Sarabun New"/>
+                <w:b w:val="0"/>
+                <w:sz w:val="22"/>
+                <w:szCs w:val="22"/>
+                <w:lang w:bidi="th-TH"/>
+              </w:rPr>
+              <w:t>ลูก​ที่อยู่​ด้วย</w:t>
             </w:r>
           </w:p>
         </w:tc>
@@ -811,7 +1064,7 @@
       <w:tr>
         <w:tc>
           <w:tcPr>
-            <w:tcW w:type="dxa" w:w="2835"/>
+            <w:tcW w:type="dxa" w:w="1928"/>
           </w:tcPr>
           <w:p>
             <w:pPr>
@@ -822,18 +1075,18 @@
               <w:rPr>
                 <w:rFonts w:ascii="TH Sarabun New" w:hAnsi="TH Sarabun New" w:cs="TH Sarabun New" w:eastAsia="TH Sarabun New"/>
                 <w:b/>
-                <w:sz w:val="24"/>
-                <w:szCs w:val="24"/>
+                <w:sz w:val="22"/>
+                <w:szCs w:val="22"/>
                 <w:bCs/>
                 <w:lang w:bidi="th-TH"/>
               </w:rPr>
-              <w:t>เข้าใจ​ว่า​โปรแกรม​ทำ​อะไร (​คำ​ของ​ผู้ให้ข้อมูล​)</w:t>
+              <w:t>อุปสรรค</w:t>
             </w:r>
           </w:p>
         </w:tc>
         <w:tc>
           <w:tcPr>
-            <w:tcW w:type="dxa" w:w="3515"/>
+            <w:tcW w:type="dxa" w:w="2665"/>
           </w:tcPr>
           <w:p>
             <w:pPr>
@@ -844,17 +1097,17 @@
               <w:rPr>
                 <w:rFonts w:ascii="TH Sarabun New" w:hAnsi="TH Sarabun New" w:cs="TH Sarabun New" w:eastAsia="TH Sarabun New"/>
                 <w:b w:val="0"/>
-                <w:sz w:val="24"/>
-                <w:szCs w:val="24"/>
+                <w:sz w:val="22"/>
+                <w:szCs w:val="22"/>
                 <w:lang w:bidi="th-TH"/>
               </w:rPr>
-              <w:t>โปรแกรม​แจ้ง​เตือน​และ​ตรวจจับ​ความผิดปกติ</w:t>
+              <w:t>กด​ไม่​เป็น ทำ​ไม่​เป็น</w:t>
             </w:r>
           </w:p>
         </w:tc>
         <w:tc>
           <w:tcPr>
-            <w:tcW w:type="dxa" w:w="3515"/>
+            <w:tcW w:type="dxa" w:w="2665"/>
           </w:tcPr>
           <w:p>
             <w:pPr>
@@ -865,11 +1118,32 @@
               <w:rPr>
                 <w:rFonts w:ascii="TH Sarabun New" w:hAnsi="TH Sarabun New" w:cs="TH Sarabun New" w:eastAsia="TH Sarabun New"/>
                 <w:b w:val="0"/>
-                <w:sz w:val="24"/>
-                <w:szCs w:val="24"/>
+                <w:sz w:val="22"/>
+                <w:szCs w:val="22"/>
                 <w:lang w:bidi="th-TH"/>
               </w:rPr>
-              <w:t>โปรแกรม​ที่​บ่งบอก​และ​ประเมิน​สุขภาพ</w:t>
+              <w:t>ทำ​ไม่​เป็น</w:t>
+            </w:r>
+          </w:p>
+        </w:tc>
+        <w:tc>
+          <w:tcPr>
+            <w:tcW w:type="dxa" w:w="2665"/>
+          </w:tcPr>
+          <w:p>
+            <w:pPr>
+              <w:spacing w:after="0" w:line="240" w:lineRule="auto"/>
+            </w:pPr>
+            <w:r/>
+            <w:r>
+              <w:rPr>
+                <w:rFonts w:ascii="TH Sarabun New" w:hAnsi="TH Sarabun New" w:cs="TH Sarabun New" w:eastAsia="TH Sarabun New"/>
+                <w:b w:val="0"/>
+                <w:sz w:val="22"/>
+                <w:szCs w:val="22"/>
+                <w:lang w:bidi="th-TH"/>
+              </w:rPr>
+              <w:t>ตั้ง​กล้อง​ไม่​เป็น</w:t>
             </w:r>
           </w:p>
         </w:tc>
@@ -877,7 +1151,7 @@
       <w:tr>
         <w:tc>
           <w:tcPr>
-            <w:tcW w:type="dxa" w:w="2835"/>
+            <w:tcW w:type="dxa" w:w="1928"/>
           </w:tcPr>
           <w:p>
             <w:pPr>
@@ -888,18 +1162,18 @@
               <w:rPr>
                 <w:rFonts w:ascii="TH Sarabun New" w:hAnsi="TH Sarabun New" w:cs="TH Sarabun New" w:eastAsia="TH Sarabun New"/>
                 <w:b/>
-                <w:sz w:val="24"/>
-                <w:szCs w:val="24"/>
+                <w:sz w:val="22"/>
+                <w:szCs w:val="22"/>
                 <w:bCs/>
                 <w:lang w:bidi="th-TH"/>
               </w:rPr>
-              <w:t>โปรแกรม​ช่วย​เรื่อง​ความเสี่ยง​ล้ม​ได้​ไหม</w:t>
+              <w:t>ฟีเจอร์ 3 อันดับ</w:t>
             </w:r>
           </w:p>
         </w:tc>
         <w:tc>
           <w:tcPr>
-            <w:tcW w:type="dxa" w:w="3515"/>
+            <w:tcW w:type="dxa" w:w="2665"/>
           </w:tcPr>
           <w:p>
             <w:pPr>
@@ -910,17 +1184,17 @@
               <w:rPr>
                 <w:rFonts w:ascii="TH Sarabun New" w:hAnsi="TH Sarabun New" w:cs="TH Sarabun New" w:eastAsia="TH Sarabun New"/>
                 <w:b w:val="0"/>
-                <w:sz w:val="24"/>
-                <w:szCs w:val="24"/>
+                <w:sz w:val="22"/>
+                <w:szCs w:val="22"/>
                 <w:lang w:bidi="th-TH"/>
               </w:rPr>
-              <w:t>ยัง​ไม่​แน่ใจ</w:t>
+              <w:t>1. F3 ลูกหลาน​ได้รับ​แจ้ง​เมื่อ​ผล​แย่​ลง  2. F1 ประเมิน​ความเสี่ยง​จาก​ที่​บ้าน​ผ่าน​กล้อง​มือถือ  3. F4 เจ้าหน้าที่​โทร​หา​เมื่อ​พบ​ความเสี่ยง</w:t>
             </w:r>
           </w:p>
         </w:tc>
         <w:tc>
           <w:tcPr>
-            <w:tcW w:type="dxa" w:w="3515"/>
+            <w:tcW w:type="dxa" w:w="2665"/>
           </w:tcPr>
           <w:p>
             <w:pPr>
@@ -931,11 +1205,32 @@
               <w:rPr>
                 <w:rFonts w:ascii="TH Sarabun New" w:hAnsi="TH Sarabun New" w:cs="TH Sarabun New" w:eastAsia="TH Sarabun New"/>
                 <w:b w:val="0"/>
-                <w:sz w:val="24"/>
-                <w:szCs w:val="24"/>
+                <w:sz w:val="22"/>
+                <w:szCs w:val="22"/>
                 <w:lang w:bidi="th-TH"/>
               </w:rPr>
-              <w:t>–</w:t>
+              <w:t>1. F3 ลูกหลาน​ได้รับ​แจ้ง​เมื่อ​ผล​แย่​ลง  2. F2 รู้​ผล​ทันที​ว่า​เสี่ยง​ระดับ​ไหน พร้อม​เหตุผล  3. F1 ประเมิน​ความเสี่ยง​จาก​ที่​บ้าน​ผ่าน​กล้อง​มือถือ</w:t>
+            </w:r>
+          </w:p>
+        </w:tc>
+        <w:tc>
+          <w:tcPr>
+            <w:tcW w:type="dxa" w:w="2665"/>
+          </w:tcPr>
+          <w:p>
+            <w:pPr>
+              <w:spacing w:after="0" w:line="240" w:lineRule="auto"/>
+            </w:pPr>
+            <w:r/>
+            <w:r>
+              <w:rPr>
+                <w:rFonts w:ascii="TH Sarabun New" w:hAnsi="TH Sarabun New" w:cs="TH Sarabun New" w:eastAsia="TH Sarabun New"/>
+                <w:b w:val="0"/>
+                <w:sz w:val="22"/>
+                <w:szCs w:val="22"/>
+                <w:lang w:bidi="th-TH"/>
+              </w:rPr>
+              <w:t>1. F3 ลูกหลาน​ได้รับ​แจ้ง​เมื่อ​ผล​แย่​ลง  2. F2 รู้​ผล​ทันที​ว่า​เสี่ยง​ระดับ​ไหน พร้อม​เหตุผล  3. F1 ประเมิน​ความเสี่ยง​จาก​ที่​บ้าน​ผ่าน​กล้อง​มือถือ</w:t>
             </w:r>
           </w:p>
         </w:tc>
@@ -943,7 +1238,7 @@
       <w:tr>
         <w:tc>
           <w:tcPr>
-            <w:tcW w:type="dxa" w:w="2835"/>
+            <w:tcW w:type="dxa" w:w="1928"/>
           </w:tcPr>
           <w:p>
             <w:pPr>
@@ -954,18 +1249,18 @@
               <w:rPr>
                 <w:rFonts w:ascii="TH Sarabun New" w:hAnsi="TH Sarabun New" w:cs="TH Sarabun New" w:eastAsia="TH Sarabun New"/>
                 <w:b/>
-                <w:sz w:val="24"/>
-                <w:szCs w:val="24"/>
+                <w:sz w:val="22"/>
+                <w:szCs w:val="22"/>
                 <w:bCs/>
                 <w:lang w:bidi="th-TH"/>
               </w:rPr>
-              <w:t>อุปสรรค​ใน​การ​ใช้</w:t>
+              <w:t>เหตุผล</w:t>
             </w:r>
           </w:p>
         </w:tc>
         <w:tc>
           <w:tcPr>
-            <w:tcW w:type="dxa" w:w="3515"/>
+            <w:tcW w:type="dxa" w:w="2665"/>
           </w:tcPr>
           <w:p>
             <w:pPr>
@@ -976,17 +1271,17 @@
               <w:rPr>
                 <w:rFonts w:ascii="TH Sarabun New" w:hAnsi="TH Sarabun New" w:cs="TH Sarabun New" w:eastAsia="TH Sarabun New"/>
                 <w:b w:val="0"/>
-                <w:sz w:val="24"/>
-                <w:szCs w:val="24"/>
+                <w:sz w:val="22"/>
+                <w:szCs w:val="22"/>
                 <w:lang w:bidi="th-TH"/>
               </w:rPr>
-              <w:t>การ​เข้า​ใช้​โปรแกรม</w:t>
+              <w:t>อยาก​ตรวจ​ที่​บ้าน เพราะ​รถ​หา​ยาก เดินทาง​ลำบาก</w:t>
             </w:r>
           </w:p>
         </w:tc>
         <w:tc>
           <w:tcPr>
-            <w:tcW w:type="dxa" w:w="3515"/>
+            <w:tcW w:type="dxa" w:w="2665"/>
           </w:tcPr>
           <w:p>
             <w:pPr>
@@ -997,11 +1292,32 @@
               <w:rPr>
                 <w:rFonts w:ascii="TH Sarabun New" w:hAnsi="TH Sarabun New" w:cs="TH Sarabun New" w:eastAsia="TH Sarabun New"/>
                 <w:b w:val="0"/>
-                <w:sz w:val="24"/>
-                <w:szCs w:val="24"/>
+                <w:sz w:val="22"/>
+                <w:szCs w:val="22"/>
                 <w:lang w:bidi="th-TH"/>
               </w:rPr>
               <w:t>–</w:t>
+            </w:r>
+          </w:p>
+        </w:tc>
+        <w:tc>
+          <w:tcPr>
+            <w:tcW w:type="dxa" w:w="2665"/>
+          </w:tcPr>
+          <w:p>
+            <w:pPr>
+              <w:spacing w:after="0" w:line="240" w:lineRule="auto"/>
+            </w:pPr>
+            <w:r/>
+            <w:r>
+              <w:rPr>
+                <w:rFonts w:ascii="TH Sarabun New" w:hAnsi="TH Sarabun New" w:cs="TH Sarabun New" w:eastAsia="TH Sarabun New"/>
+                <w:b w:val="0"/>
+                <w:sz w:val="22"/>
+                <w:szCs w:val="22"/>
+                <w:lang w:bidi="th-TH"/>
+              </w:rPr>
+              <w:t>อยากรู้​ว่า​ตัวเอง​เสี่ยง​อยู่​ระดับ​ไหน</w:t>
             </w:r>
           </w:p>
         </w:tc>
@@ -1009,7 +1325,7 @@
       <w:tr>
         <w:tc>
           <w:tcPr>
-            <w:tcW w:type="dxa" w:w="2835"/>
+            <w:tcW w:type="dxa" w:w="1928"/>
           </w:tcPr>
           <w:p>
             <w:pPr>
@@ -1020,18 +1336,18 @@
               <w:rPr>
                 <w:rFonts w:ascii="TH Sarabun New" w:hAnsi="TH Sarabun New" w:cs="TH Sarabun New" w:eastAsia="TH Sarabun New"/>
                 <w:b/>
-                <w:sz w:val="24"/>
-                <w:szCs w:val="24"/>
+                <w:sz w:val="22"/>
+                <w:szCs w:val="22"/>
                 <w:bCs/>
                 <w:lang w:bidi="th-TH"/>
               </w:rPr>
-              <w:t>ฟีเจอร์​อันดับ 1–3</w:t>
+              <w:t>หมายเหตุ​การ​เลือก</w:t>
             </w:r>
           </w:p>
         </w:tc>
         <w:tc>
           <w:tcPr>
-            <w:tcW w:type="dxa" w:w="3515"/>
+            <w:tcW w:type="dxa" w:w="2665"/>
           </w:tcPr>
           <w:p>
             <w:pPr>
@@ -1042,17 +1358,17 @@
               <w:rPr>
                 <w:rFonts w:ascii="TH Sarabun New" w:hAnsi="TH Sarabun New" w:cs="TH Sarabun New" w:eastAsia="TH Sarabun New"/>
                 <w:b w:val="0"/>
-                <w:sz w:val="24"/>
-                <w:szCs w:val="24"/>
+                <w:sz w:val="22"/>
+                <w:szCs w:val="22"/>
                 <w:lang w:bidi="th-TH"/>
               </w:rPr>
-              <w:t>1. F2 รู้​ผล​ทันที​ว่า​เสี่ยง​ระดับ​ไหน พร้อม​เหตุผล  2. F7 ดู​ย้อนหลัง​ว่า​ดีขึ้น​หรือ​แย่​ลง  3. F1 ประเมิน​ความเสี่ยง​จาก​ที่​บ้าน​ผ่าน​กล้อง​มือถือ</w:t>
+              <w:t>อันดับ 3 ผู้สัมภาษณ์​ถามนำ แล้ว​ผู้ให้ข้อมูล​ตอบ​ว่า​ดี</w:t>
             </w:r>
           </w:p>
         </w:tc>
         <w:tc>
           <w:tcPr>
-            <w:tcW w:type="dxa" w:w="3515"/>
+            <w:tcW w:type="dxa" w:w="2665"/>
           </w:tcPr>
           <w:p>
             <w:pPr>
@@ -1063,11 +1379,32 @@
               <w:rPr>
                 <w:rFonts w:ascii="TH Sarabun New" w:hAnsi="TH Sarabun New" w:cs="TH Sarabun New" w:eastAsia="TH Sarabun New"/>
                 <w:b w:val="0"/>
-                <w:sz w:val="24"/>
-                <w:szCs w:val="24"/>
+                <w:sz w:val="22"/>
+                <w:szCs w:val="22"/>
                 <w:lang w:bidi="th-TH"/>
               </w:rPr>
-              <w:t>1. F1 ประเมิน​ความเสี่ยง​จาก​ที่​บ้าน​ผ่าน​กล้อง​มือถือ  2. F2 รู้​ผล​ทันที​ว่า​เสี่ยง​ระดับ​ไหน พร้อม​เหตุผล  3. F7 ดู​ย้อนหลัง​ว่า​ดีขึ้น​หรือ​แย่​ลง</w:t>
+              <w:t>อันดับ 1 ชัดเจน · อันดับ 2 กับ 3 เลือก​โดย​การ​ชี้ ฟัง​จาก​เสียง​ได้​ไม่​ชัด</w:t>
+            </w:r>
+          </w:p>
+        </w:tc>
+        <w:tc>
+          <w:tcPr>
+            <w:tcW w:type="dxa" w:w="2665"/>
+          </w:tcPr>
+          <w:p>
+            <w:pPr>
+              <w:spacing w:after="0" w:line="240" w:lineRule="auto"/>
+            </w:pPr>
+            <w:r/>
+            <w:r>
+              <w:rPr>
+                <w:rFonts w:ascii="TH Sarabun New" w:hAnsi="TH Sarabun New" w:cs="TH Sarabun New" w:eastAsia="TH Sarabun New"/>
+                <w:b w:val="0"/>
+                <w:sz w:val="22"/>
+                <w:szCs w:val="22"/>
+                <w:lang w:bidi="th-TH"/>
+              </w:rPr>
+              <w:t>อันดับ 1 ชัดเจน · ตอน​เลือก​อันดับ 2 มีการพูดถึงทั้งรู้ผลทันทีและเภสัชกร</w:t>
             </w:r>
           </w:p>
         </w:tc>
@@ -1093,148 +1430,1032 @@
           <w:bCs/>
           <w:lang w:bidi="th-TH"/>
         </w:rPr>
-        <w:t>กลุ่มผู้สูงอายุ 3 คน (​แม่บ้าน​อายุ 60 ปี​ขึ้นไป · สัมภาษณ์​) — สรุป​รวม</w:t>
+        <w:t>กลุ่ม​ลูกหลาน​ผู้ดูแล 2 คน</w:t>
       </w:r>
     </w:p>
+    <w:tbl>
+      <w:tblPr>
+        <w:tblW w:type="auto" w:w="0"/>
+        <w:jc w:val="center"/>
+        <w:tblLayout w:type="fixed"/>
+        <w:tblLook w:firstColumn="1" w:firstRow="1" w:lastColumn="0" w:lastRow="0" w:noHBand="0" w:noVBand="1" w:val="04A0"/>
+        <w:tblBorders>
+          <w:top w:val="single" w:sz="6" w:space="0" w:color="9AA8BD"/>
+          <w:left w:val="single" w:sz="6" w:space="0" w:color="9AA8BD"/>
+          <w:bottom w:val="single" w:sz="6" w:space="0" w:color="9AA8BD"/>
+          <w:right w:val="single" w:sz="6" w:space="0" w:color="9AA8BD"/>
+          <w:insideH w:val="single" w:sz="6" w:space="0" w:color="9AA8BD"/>
+          <w:insideV w:val="single" w:sz="6" w:space="0" w:color="9AA8BD"/>
+        </w:tblBorders>
+      </w:tblPr>
+      <w:tblGrid>
+        <w:gridCol w:w="3326"/>
+        <w:gridCol w:w="3326"/>
+        <w:gridCol w:w="3326"/>
+      </w:tblGrid>
+      <w:tr>
+        <w:tc>
+          <w:tcPr>
+            <w:tcW w:type="dxa" w:w="2041"/>
+            <w:shd w:val="clear" w:color="auto" w:fill="DCEBFB"/>
+          </w:tcPr>
+          <w:p>
+            <w:pPr>
+              <w:spacing w:after="0" w:line="240" w:lineRule="auto"/>
+            </w:pPr>
+            <w:r/>
+            <w:r>
+              <w:rPr>
+                <w:rFonts w:ascii="TH Sarabun New" w:hAnsi="TH Sarabun New" w:cs="TH Sarabun New" w:eastAsia="TH Sarabun New"/>
+                <w:b/>
+                <w:color w:val="143A74"/>
+                <w:sz w:val="22"/>
+                <w:szCs w:val="22"/>
+                <w:bCs/>
+                <w:lang w:bidi="th-TH"/>
+              </w:rPr>
+              <w:t>หัวข้อ</w:t>
+            </w:r>
+          </w:p>
+        </w:tc>
+        <w:tc>
+          <w:tcPr>
+            <w:tcW w:type="dxa" w:w="3969"/>
+            <w:shd w:val="clear" w:color="auto" w:fill="DCEBFB"/>
+          </w:tcPr>
+          <w:p>
+            <w:pPr>
+              <w:spacing w:after="0" w:line="240" w:lineRule="auto"/>
+            </w:pPr>
+            <w:r/>
+            <w:r>
+              <w:rPr>
+                <w:rFonts w:ascii="TH Sarabun New" w:hAnsi="TH Sarabun New" w:cs="TH Sarabun New" w:eastAsia="TH Sarabun New"/>
+                <w:b/>
+                <w:color w:val="143A74"/>
+                <w:sz w:val="22"/>
+                <w:szCs w:val="22"/>
+                <w:bCs/>
+                <w:lang w:bidi="th-TH"/>
+              </w:rPr>
+              <w:t>R01</w:t>
+            </w:r>
+          </w:p>
+        </w:tc>
+        <w:tc>
+          <w:tcPr>
+            <w:tcW w:type="dxa" w:w="3969"/>
+            <w:shd w:val="clear" w:color="auto" w:fill="DCEBFB"/>
+          </w:tcPr>
+          <w:p>
+            <w:pPr>
+              <w:spacing w:after="0" w:line="240" w:lineRule="auto"/>
+            </w:pPr>
+            <w:r/>
+            <w:r>
+              <w:rPr>
+                <w:rFonts w:ascii="TH Sarabun New" w:hAnsi="TH Sarabun New" w:cs="TH Sarabun New" w:eastAsia="TH Sarabun New"/>
+                <w:b/>
+                <w:color w:val="143A74"/>
+                <w:sz w:val="22"/>
+                <w:szCs w:val="22"/>
+                <w:bCs/>
+                <w:lang w:bidi="th-TH"/>
+              </w:rPr>
+              <w:t>R05</w:t>
+            </w:r>
+          </w:p>
+        </w:tc>
+      </w:tr>
+      <w:tr>
+        <w:tc>
+          <w:tcPr>
+            <w:tcW w:type="dxa" w:w="2041"/>
+          </w:tcPr>
+          <w:p>
+            <w:pPr>
+              <w:spacing w:after="0" w:line="240" w:lineRule="auto"/>
+            </w:pPr>
+            <w:r/>
+            <w:r>
+              <w:rPr>
+                <w:rFonts w:ascii="TH Sarabun New" w:hAnsi="TH Sarabun New" w:cs="TH Sarabun New" w:eastAsia="TH Sarabun New"/>
+                <w:b/>
+                <w:sz w:val="22"/>
+                <w:szCs w:val="22"/>
+                <w:bCs/>
+                <w:lang w:bidi="th-TH"/>
+              </w:rPr>
+              <w:t>อายุ​พ่อ​หรือ​แม่</w:t>
+            </w:r>
+          </w:p>
+        </w:tc>
+        <w:tc>
+          <w:tcPr>
+            <w:tcW w:type="dxa" w:w="3969"/>
+          </w:tcPr>
+          <w:p>
+            <w:pPr>
+              <w:spacing w:after="0" w:line="240" w:lineRule="auto"/>
+            </w:pPr>
+            <w:r/>
+            <w:r>
+              <w:rPr>
+                <w:rFonts w:ascii="TH Sarabun New" w:hAnsi="TH Sarabun New" w:cs="TH Sarabun New" w:eastAsia="TH Sarabun New"/>
+                <w:b w:val="0"/>
+                <w:sz w:val="22"/>
+                <w:szCs w:val="22"/>
+                <w:lang w:bidi="th-TH"/>
+              </w:rPr>
+              <w:t>75 ปี</w:t>
+            </w:r>
+          </w:p>
+        </w:tc>
+        <w:tc>
+          <w:tcPr>
+            <w:tcW w:type="dxa" w:w="3969"/>
+          </w:tcPr>
+          <w:p>
+            <w:pPr>
+              <w:spacing w:after="0" w:line="240" w:lineRule="auto"/>
+            </w:pPr>
+            <w:r/>
+            <w:r>
+              <w:rPr>
+                <w:rFonts w:ascii="TH Sarabun New" w:hAnsi="TH Sarabun New" w:cs="TH Sarabun New" w:eastAsia="TH Sarabun New"/>
+                <w:b w:val="0"/>
+                <w:sz w:val="22"/>
+                <w:szCs w:val="22"/>
+                <w:lang w:bidi="th-TH"/>
+              </w:rPr>
+              <w:t>76 ปี</w:t>
+            </w:r>
+          </w:p>
+        </w:tc>
+      </w:tr>
+      <w:tr>
+        <w:tc>
+          <w:tcPr>
+            <w:tcW w:type="dxa" w:w="2041"/>
+          </w:tcPr>
+          <w:p>
+            <w:pPr>
+              <w:spacing w:after="0" w:line="240" w:lineRule="auto"/>
+            </w:pPr>
+            <w:r/>
+            <w:r>
+              <w:rPr>
+                <w:rFonts w:ascii="TH Sarabun New" w:hAnsi="TH Sarabun New" w:cs="TH Sarabun New" w:eastAsia="TH Sarabun New"/>
+                <w:b/>
+                <w:sz w:val="22"/>
+                <w:szCs w:val="22"/>
+                <w:bCs/>
+                <w:lang w:bidi="th-TH"/>
+              </w:rPr>
+              <w:t>วิธี​เก็บ​ข้อมูล</w:t>
+            </w:r>
+          </w:p>
+        </w:tc>
+        <w:tc>
+          <w:tcPr>
+            <w:tcW w:type="dxa" w:w="3969"/>
+          </w:tcPr>
+          <w:p>
+            <w:pPr>
+              <w:spacing w:after="0" w:line="240" w:lineRule="auto"/>
+            </w:pPr>
+            <w:r/>
+            <w:r>
+              <w:rPr>
+                <w:rFonts w:ascii="TH Sarabun New" w:hAnsi="TH Sarabun New" w:cs="TH Sarabun New" w:eastAsia="TH Sarabun New"/>
+                <w:b w:val="0"/>
+                <w:sz w:val="22"/>
+                <w:szCs w:val="22"/>
+                <w:lang w:bidi="th-TH"/>
+              </w:rPr>
+              <w:t>แบบสอบถาม​ตอบ​เอง</w:t>
+            </w:r>
+          </w:p>
+        </w:tc>
+        <w:tc>
+          <w:tcPr>
+            <w:tcW w:type="dxa" w:w="3969"/>
+          </w:tcPr>
+          <w:p>
+            <w:pPr>
+              <w:spacing w:after="0" w:line="240" w:lineRule="auto"/>
+            </w:pPr>
+            <w:r/>
+            <w:r>
+              <w:rPr>
+                <w:rFonts w:ascii="TH Sarabun New" w:hAnsi="TH Sarabun New" w:cs="TH Sarabun New" w:eastAsia="TH Sarabun New"/>
+                <w:b w:val="0"/>
+                <w:sz w:val="22"/>
+                <w:szCs w:val="22"/>
+                <w:lang w:bidi="th-TH"/>
+              </w:rPr>
+              <w:t>สัมภาษณ์ บันทึก​วิดีโอ</w:t>
+            </w:r>
+          </w:p>
+        </w:tc>
+      </w:tr>
+      <w:tr>
+        <w:tc>
+          <w:tcPr>
+            <w:tcW w:type="dxa" w:w="2041"/>
+          </w:tcPr>
+          <w:p>
+            <w:pPr>
+              <w:spacing w:after="0" w:line="240" w:lineRule="auto"/>
+            </w:pPr>
+            <w:r/>
+            <w:r>
+              <w:rPr>
+                <w:rFonts w:ascii="TH Sarabun New" w:hAnsi="TH Sarabun New" w:cs="TH Sarabun New" w:eastAsia="TH Sarabun New"/>
+                <w:b/>
+                <w:sz w:val="22"/>
+                <w:szCs w:val="22"/>
+                <w:bCs/>
+                <w:lang w:bidi="th-TH"/>
+              </w:rPr>
+              <w:t>การ​หกล้ม​ใน​ปี​ที่ผ่านมา</w:t>
+            </w:r>
+          </w:p>
+        </w:tc>
+        <w:tc>
+          <w:tcPr>
+            <w:tcW w:type="dxa" w:w="3969"/>
+          </w:tcPr>
+          <w:p>
+            <w:pPr>
+              <w:spacing w:after="0" w:line="240" w:lineRule="auto"/>
+            </w:pPr>
+            <w:r/>
+            <w:r>
+              <w:rPr>
+                <w:rFonts w:ascii="TH Sarabun New" w:hAnsi="TH Sarabun New" w:cs="TH Sarabun New" w:eastAsia="TH Sarabun New"/>
+                <w:b w:val="0"/>
+                <w:sz w:val="22"/>
+                <w:szCs w:val="22"/>
+                <w:lang w:bidi="th-TH"/>
+              </w:rPr>
+              <w:t>พ่อแม่​เคย​ล้ม​หรือ​เกือบ​ล้ม (​ข้อ​คำถาม​รวม​ล้ม​และ​เกือบ​ล้ม​)</w:t>
+            </w:r>
+          </w:p>
+        </w:tc>
+        <w:tc>
+          <w:tcPr>
+            <w:tcW w:type="dxa" w:w="3969"/>
+          </w:tcPr>
+          <w:p>
+            <w:pPr>
+              <w:spacing w:after="0" w:line="240" w:lineRule="auto"/>
+            </w:pPr>
+            <w:r/>
+            <w:r>
+              <w:rPr>
+                <w:rFonts w:ascii="TH Sarabun New" w:hAnsi="TH Sarabun New" w:cs="TH Sarabun New" w:eastAsia="TH Sarabun New"/>
+                <w:b w:val="0"/>
+                <w:sz w:val="22"/>
+                <w:szCs w:val="22"/>
+                <w:lang w:bidi="th-TH"/>
+              </w:rPr>
+              <w:t>คุณพ่อ​ล้ม​ประมาณ 3 ครั้ง ครั้ง​ล่าสุด​ต้นปี 2569 รู้​เพราะ​พ่อ​บอก​และ​เห็น​รอย​ฟกช้ำ</w:t>
+            </w:r>
+          </w:p>
+        </w:tc>
+      </w:tr>
+      <w:tr>
+        <w:tc>
+          <w:tcPr>
+            <w:tcW w:type="dxa" w:w="2041"/>
+          </w:tcPr>
+          <w:p>
+            <w:pPr>
+              <w:spacing w:after="0" w:line="240" w:lineRule="auto"/>
+            </w:pPr>
+            <w:r/>
+            <w:r>
+              <w:rPr>
+                <w:rFonts w:ascii="TH Sarabun New" w:hAnsi="TH Sarabun New" w:cs="TH Sarabun New" w:eastAsia="TH Sarabun New"/>
+                <w:b/>
+                <w:sz w:val="22"/>
+                <w:szCs w:val="22"/>
+                <w:bCs/>
+                <w:lang w:bidi="th-TH"/>
+              </w:rPr>
+              <w:t>เคย​ถูก​ประเมิน​การทรงตัว</w:t>
+            </w:r>
+          </w:p>
+        </w:tc>
+        <w:tc>
+          <w:tcPr>
+            <w:tcW w:type="dxa" w:w="3969"/>
+          </w:tcPr>
+          <w:p>
+            <w:pPr>
+              <w:spacing w:after="0" w:line="240" w:lineRule="auto"/>
+            </w:pPr>
+            <w:r/>
+            <w:r>
+              <w:rPr>
+                <w:rFonts w:ascii="TH Sarabun New" w:hAnsi="TH Sarabun New" w:cs="TH Sarabun New" w:eastAsia="TH Sarabun New"/>
+                <w:b w:val="0"/>
+                <w:sz w:val="22"/>
+                <w:szCs w:val="22"/>
+                <w:lang w:bidi="th-TH"/>
+              </w:rPr>
+              <w:t>ไม่​เคย</w:t>
+            </w:r>
+          </w:p>
+        </w:tc>
+        <w:tc>
+          <w:tcPr>
+            <w:tcW w:type="dxa" w:w="3969"/>
+          </w:tcPr>
+          <w:p>
+            <w:pPr>
+              <w:spacing w:after="0" w:line="240" w:lineRule="auto"/>
+            </w:pPr>
+            <w:r/>
+            <w:r>
+              <w:rPr>
+                <w:rFonts w:ascii="TH Sarabun New" w:hAnsi="TH Sarabun New" w:cs="TH Sarabun New" w:eastAsia="TH Sarabun New"/>
+                <w:b w:val="0"/>
+                <w:sz w:val="22"/>
+                <w:szCs w:val="22"/>
+                <w:lang w:bidi="th-TH"/>
+              </w:rPr>
+              <w:t>ไม่​เคย</w:t>
+            </w:r>
+          </w:p>
+        </w:tc>
+      </w:tr>
+      <w:tr>
+        <w:tc>
+          <w:tcPr>
+            <w:tcW w:type="dxa" w:w="2041"/>
+          </w:tcPr>
+          <w:p>
+            <w:pPr>
+              <w:spacing w:after="0" w:line="240" w:lineRule="auto"/>
+            </w:pPr>
+            <w:r/>
+            <w:r>
+              <w:rPr>
+                <w:rFonts w:ascii="TH Sarabun New" w:hAnsi="TH Sarabun New" w:cs="TH Sarabun New" w:eastAsia="TH Sarabun New"/>
+                <w:b/>
+                <w:sz w:val="22"/>
+                <w:szCs w:val="22"/>
+                <w:bCs/>
+                <w:lang w:bidi="th-TH"/>
+              </w:rPr>
+              <w:t>สุขภาพ / ความกังวล</w:t>
+            </w:r>
+          </w:p>
+        </w:tc>
+        <w:tc>
+          <w:tcPr>
+            <w:tcW w:type="dxa" w:w="3969"/>
+          </w:tcPr>
+          <w:p>
+            <w:pPr>
+              <w:spacing w:after="0" w:line="240" w:lineRule="auto"/>
+            </w:pPr>
+            <w:r/>
+            <w:r>
+              <w:rPr>
+                <w:rFonts w:ascii="TH Sarabun New" w:hAnsi="TH Sarabun New" w:cs="TH Sarabun New" w:eastAsia="TH Sarabun New"/>
+                <w:b w:val="0"/>
+                <w:sz w:val="22"/>
+                <w:szCs w:val="22"/>
+                <w:lang w:bidi="th-TH"/>
+              </w:rPr>
+              <w:t>กังวล​เรื่อง​การล้ม​มาก</w:t>
+            </w:r>
+          </w:p>
+        </w:tc>
+        <w:tc>
+          <w:tcPr>
+            <w:tcW w:type="dxa" w:w="3969"/>
+          </w:tcPr>
+          <w:p>
+            <w:pPr>
+              <w:spacing w:after="0" w:line="240" w:lineRule="auto"/>
+            </w:pPr>
+            <w:r/>
+            <w:r>
+              <w:rPr>
+                <w:rFonts w:ascii="TH Sarabun New" w:hAnsi="TH Sarabun New" w:cs="TH Sarabun New" w:eastAsia="TH Sarabun New"/>
+                <w:b w:val="0"/>
+                <w:sz w:val="22"/>
+                <w:szCs w:val="22"/>
+                <w:lang w:bidi="th-TH"/>
+              </w:rPr>
+              <w:t>คุณพ่อ​สุขภาพ​ไม่​แข็งแรง มี​โรคประจำตัว</w:t>
+            </w:r>
+          </w:p>
+        </w:tc>
+      </w:tr>
+      <w:tr>
+        <w:tc>
+          <w:tcPr>
+            <w:tcW w:type="dxa" w:w="2041"/>
+          </w:tcPr>
+          <w:p>
+            <w:pPr>
+              <w:spacing w:after="0" w:line="240" w:lineRule="auto"/>
+            </w:pPr>
+            <w:r/>
+            <w:r>
+              <w:rPr>
+                <w:rFonts w:ascii="TH Sarabun New" w:hAnsi="TH Sarabun New" w:cs="TH Sarabun New" w:eastAsia="TH Sarabun New"/>
+                <w:b/>
+                <w:sz w:val="22"/>
+                <w:szCs w:val="22"/>
+                <w:bCs/>
+                <w:lang w:bidi="th-TH"/>
+              </w:rPr>
+              <w:t>รู้​อาการ​พ่อแม่​อย่างไร</w:t>
+            </w:r>
+          </w:p>
+        </w:tc>
+        <w:tc>
+          <w:tcPr>
+            <w:tcW w:type="dxa" w:w="3969"/>
+          </w:tcPr>
+          <w:p>
+            <w:pPr>
+              <w:spacing w:after="0" w:line="240" w:lineRule="auto"/>
+            </w:pPr>
+            <w:r/>
+            <w:r>
+              <w:rPr>
+                <w:rFonts w:ascii="TH Sarabun New" w:hAnsi="TH Sarabun New" w:cs="TH Sarabun New" w:eastAsia="TH Sarabun New"/>
+                <w:b w:val="0"/>
+                <w:sz w:val="22"/>
+                <w:szCs w:val="22"/>
+                <w:lang w:bidi="th-TH"/>
+              </w:rPr>
+              <w:t>–</w:t>
+            </w:r>
+          </w:p>
+        </w:tc>
+        <w:tc>
+          <w:tcPr>
+            <w:tcW w:type="dxa" w:w="3969"/>
+          </w:tcPr>
+          <w:p>
+            <w:pPr>
+              <w:spacing w:after="0" w:line="240" w:lineRule="auto"/>
+            </w:pPr>
+            <w:r/>
+            <w:r>
+              <w:rPr>
+                <w:rFonts w:ascii="TH Sarabun New" w:hAnsi="TH Sarabun New" w:cs="TH Sarabun New" w:eastAsia="TH Sarabun New"/>
+                <w:b w:val="0"/>
+                <w:sz w:val="22"/>
+                <w:szCs w:val="22"/>
+                <w:lang w:bidi="th-TH"/>
+              </w:rPr>
+              <w:t>รู้​จาก​การ​โทร​หา​และ​คุณพ่อ​เล่า (​อยู่​บ้าน​เดียวกัน​)</w:t>
+            </w:r>
+          </w:p>
+        </w:tc>
+      </w:tr>
+      <w:tr>
+        <w:tc>
+          <w:tcPr>
+            <w:tcW w:type="dxa" w:w="2041"/>
+          </w:tcPr>
+          <w:p>
+            <w:pPr>
+              <w:spacing w:after="0" w:line="240" w:lineRule="auto"/>
+            </w:pPr>
+            <w:r/>
+            <w:r>
+              <w:rPr>
+                <w:rFonts w:ascii="TH Sarabun New" w:hAnsi="TH Sarabun New" w:cs="TH Sarabun New" w:eastAsia="TH Sarabun New"/>
+                <w:b/>
+                <w:sz w:val="22"/>
+                <w:szCs w:val="22"/>
+                <w:bCs/>
+                <w:lang w:bidi="th-TH"/>
+              </w:rPr>
+              <w:t>ค่าใช้จ่าย</w:t>
+            </w:r>
+          </w:p>
+        </w:tc>
+        <w:tc>
+          <w:tcPr>
+            <w:tcW w:type="dxa" w:w="3969"/>
+          </w:tcPr>
+          <w:p>
+            <w:pPr>
+              <w:spacing w:after="0" w:line="240" w:lineRule="auto"/>
+            </w:pPr>
+            <w:r/>
+            <w:r>
+              <w:rPr>
+                <w:rFonts w:ascii="TH Sarabun New" w:hAnsi="TH Sarabun New" w:cs="TH Sarabun New" w:eastAsia="TH Sarabun New"/>
+                <w:b w:val="0"/>
+                <w:sz w:val="22"/>
+                <w:szCs w:val="22"/>
+                <w:lang w:bidi="th-TH"/>
+              </w:rPr>
+              <w:t>–</w:t>
+            </w:r>
+          </w:p>
+        </w:tc>
+        <w:tc>
+          <w:tcPr>
+            <w:tcW w:type="dxa" w:w="3969"/>
+          </w:tcPr>
+          <w:p>
+            <w:pPr>
+              <w:spacing w:after="0" w:line="240" w:lineRule="auto"/>
+            </w:pPr>
+            <w:r/>
+            <w:r>
+              <w:rPr>
+                <w:rFonts w:ascii="TH Sarabun New" w:hAnsi="TH Sarabun New" w:cs="TH Sarabun New" w:eastAsia="TH Sarabun New"/>
+                <w:b w:val="0"/>
+                <w:sz w:val="22"/>
+                <w:szCs w:val="22"/>
+                <w:lang w:bidi="th-TH"/>
+              </w:rPr>
+              <w:t>ค่ารักษา​และ​ยาบำรุง</w:t>
+            </w:r>
+          </w:p>
+        </w:tc>
+      </w:tr>
+      <w:tr>
+        <w:tc>
+          <w:tcPr>
+            <w:tcW w:type="dxa" w:w="2041"/>
+          </w:tcPr>
+          <w:p>
+            <w:pPr>
+              <w:spacing w:after="0" w:line="240" w:lineRule="auto"/>
+            </w:pPr>
+            <w:r/>
+            <w:r>
+              <w:rPr>
+                <w:rFonts w:ascii="TH Sarabun New" w:hAnsi="TH Sarabun New" w:cs="TH Sarabun New" w:eastAsia="TH Sarabun New"/>
+                <w:b/>
+                <w:sz w:val="22"/>
+                <w:szCs w:val="22"/>
+                <w:bCs/>
+                <w:lang w:bidi="th-TH"/>
+              </w:rPr>
+              <w:t>ถ้า​รู้​ว่า​เสี่ยง จะ​ทำ​อะไร</w:t>
+            </w:r>
+          </w:p>
+        </w:tc>
+        <w:tc>
+          <w:tcPr>
+            <w:tcW w:type="dxa" w:w="3969"/>
+          </w:tcPr>
+          <w:p>
+            <w:pPr>
+              <w:spacing w:after="0" w:line="240" w:lineRule="auto"/>
+            </w:pPr>
+            <w:r/>
+            <w:r>
+              <w:rPr>
+                <w:rFonts w:ascii="TH Sarabun New" w:hAnsi="TH Sarabun New" w:cs="TH Sarabun New" w:eastAsia="TH Sarabun New"/>
+                <w:b w:val="0"/>
+                <w:sz w:val="22"/>
+                <w:szCs w:val="22"/>
+                <w:lang w:bidi="th-TH"/>
+              </w:rPr>
+              <w:t>–</w:t>
+            </w:r>
+          </w:p>
+        </w:tc>
+        <w:tc>
+          <w:tcPr>
+            <w:tcW w:type="dxa" w:w="3969"/>
+          </w:tcPr>
+          <w:p>
+            <w:pPr>
+              <w:spacing w:after="0" w:line="240" w:lineRule="auto"/>
+            </w:pPr>
+            <w:r/>
+            <w:r>
+              <w:rPr>
+                <w:rFonts w:ascii="TH Sarabun New" w:hAnsi="TH Sarabun New" w:cs="TH Sarabun New" w:eastAsia="TH Sarabun New"/>
+                <w:b w:val="0"/>
+                <w:sz w:val="22"/>
+                <w:szCs w:val="22"/>
+                <w:lang w:bidi="th-TH"/>
+              </w:rPr>
+              <w:t>พา​ไป​พบ​แพทย์</w:t>
+            </w:r>
+          </w:p>
+        </w:tc>
+      </w:tr>
+      <w:tr>
+        <w:tc>
+          <w:tcPr>
+            <w:tcW w:type="dxa" w:w="2041"/>
+          </w:tcPr>
+          <w:p>
+            <w:pPr>
+              <w:spacing w:after="0" w:line="240" w:lineRule="auto"/>
+            </w:pPr>
+            <w:r/>
+            <w:r>
+              <w:rPr>
+                <w:rFonts w:ascii="TH Sarabun New" w:hAnsi="TH Sarabun New" w:cs="TH Sarabun New" w:eastAsia="TH Sarabun New"/>
+                <w:b/>
+                <w:sz w:val="22"/>
+                <w:szCs w:val="22"/>
+                <w:bCs/>
+                <w:lang w:bidi="th-TH"/>
+              </w:rPr>
+              <w:t>การ​ใช้​แอ​ป​ของ​พ่อแม่</w:t>
+            </w:r>
+          </w:p>
+        </w:tc>
+        <w:tc>
+          <w:tcPr>
+            <w:tcW w:type="dxa" w:w="3969"/>
+          </w:tcPr>
+          <w:p>
+            <w:pPr>
+              <w:spacing w:after="0" w:line="240" w:lineRule="auto"/>
+            </w:pPr>
+            <w:r/>
+            <w:r>
+              <w:rPr>
+                <w:rFonts w:ascii="TH Sarabun New" w:hAnsi="TH Sarabun New" w:cs="TH Sarabun New" w:eastAsia="TH Sarabun New"/>
+                <w:b w:val="0"/>
+                <w:sz w:val="22"/>
+                <w:szCs w:val="22"/>
+                <w:lang w:bidi="th-TH"/>
+              </w:rPr>
+              <w:t>พ่อแม่​ต้อง​มี​คน​ช่วย​ติดตั้ง</w:t>
+            </w:r>
+          </w:p>
+        </w:tc>
+        <w:tc>
+          <w:tcPr>
+            <w:tcW w:type="dxa" w:w="3969"/>
+          </w:tcPr>
+          <w:p>
+            <w:pPr>
+              <w:spacing w:after="0" w:line="240" w:lineRule="auto"/>
+            </w:pPr>
+            <w:r/>
+            <w:r>
+              <w:rPr>
+                <w:rFonts w:ascii="TH Sarabun New" w:hAnsi="TH Sarabun New" w:cs="TH Sarabun New" w:eastAsia="TH Sarabun New"/>
+                <w:b w:val="0"/>
+                <w:sz w:val="22"/>
+                <w:szCs w:val="22"/>
+                <w:lang w:bidi="th-TH"/>
+              </w:rPr>
+              <w:t>–</w:t>
+            </w:r>
+          </w:p>
+        </w:tc>
+      </w:tr>
+      <w:tr>
+        <w:tc>
+          <w:tcPr>
+            <w:tcW w:type="dxa" w:w="2041"/>
+          </w:tcPr>
+          <w:p>
+            <w:pPr>
+              <w:spacing w:after="0" w:line="240" w:lineRule="auto"/>
+            </w:pPr>
+            <w:r/>
+            <w:r>
+              <w:rPr>
+                <w:rFonts w:ascii="TH Sarabun New" w:hAnsi="TH Sarabun New" w:cs="TH Sarabun New" w:eastAsia="TH Sarabun New"/>
+                <w:b/>
+                <w:sz w:val="22"/>
+                <w:szCs w:val="22"/>
+                <w:bCs/>
+                <w:lang w:bidi="th-TH"/>
+              </w:rPr>
+              <w:t>อุปสรรค</w:t>
+            </w:r>
+          </w:p>
+        </w:tc>
+        <w:tc>
+          <w:tcPr>
+            <w:tcW w:type="dxa" w:w="3969"/>
+          </w:tcPr>
+          <w:p>
+            <w:pPr>
+              <w:spacing w:after="0" w:line="240" w:lineRule="auto"/>
+            </w:pPr>
+            <w:r/>
+            <w:r>
+              <w:rPr>
+                <w:rFonts w:ascii="TH Sarabun New" w:hAnsi="TH Sarabun New" w:cs="TH Sarabun New" w:eastAsia="TH Sarabun New"/>
+                <w:b w:val="0"/>
+                <w:sz w:val="22"/>
+                <w:szCs w:val="22"/>
+                <w:lang w:bidi="th-TH"/>
+              </w:rPr>
+              <w:t>การ​เข้า​ใช้​โปรแกรม</w:t>
+            </w:r>
+          </w:p>
+        </w:tc>
+        <w:tc>
+          <w:tcPr>
+            <w:tcW w:type="dxa" w:w="3969"/>
+          </w:tcPr>
+          <w:p>
+            <w:pPr>
+              <w:spacing w:after="0" w:line="240" w:lineRule="auto"/>
+            </w:pPr>
+            <w:r/>
+            <w:r>
+              <w:rPr>
+                <w:rFonts w:ascii="TH Sarabun New" w:hAnsi="TH Sarabun New" w:cs="TH Sarabun New" w:eastAsia="TH Sarabun New"/>
+                <w:b w:val="0"/>
+                <w:sz w:val="22"/>
+                <w:szCs w:val="22"/>
+                <w:lang w:bidi="th-TH"/>
+              </w:rPr>
+              <w:t>–</w:t>
+            </w:r>
+          </w:p>
+        </w:tc>
+      </w:tr>
+      <w:tr>
+        <w:tc>
+          <w:tcPr>
+            <w:tcW w:type="dxa" w:w="2041"/>
+          </w:tcPr>
+          <w:p>
+            <w:pPr>
+              <w:spacing w:after="0" w:line="240" w:lineRule="auto"/>
+            </w:pPr>
+            <w:r/>
+            <w:r>
+              <w:rPr>
+                <w:rFonts w:ascii="TH Sarabun New" w:hAnsi="TH Sarabun New" w:cs="TH Sarabun New" w:eastAsia="TH Sarabun New"/>
+                <w:b/>
+                <w:sz w:val="22"/>
+                <w:szCs w:val="22"/>
+                <w:bCs/>
+                <w:lang w:bidi="th-TH"/>
+              </w:rPr>
+              <w:t>เข้าใจ​ว่า​โปรแกรม​ทำ​อะไร</w:t>
+            </w:r>
+          </w:p>
+        </w:tc>
+        <w:tc>
+          <w:tcPr>
+            <w:tcW w:type="dxa" w:w="3969"/>
+          </w:tcPr>
+          <w:p>
+            <w:pPr>
+              <w:spacing w:after="0" w:line="240" w:lineRule="auto"/>
+            </w:pPr>
+            <w:r/>
+            <w:r>
+              <w:rPr>
+                <w:rFonts w:ascii="TH Sarabun New" w:hAnsi="TH Sarabun New" w:cs="TH Sarabun New" w:eastAsia="TH Sarabun New"/>
+                <w:b w:val="0"/>
+                <w:sz w:val="22"/>
+                <w:szCs w:val="22"/>
+                <w:lang w:bidi="th-TH"/>
+              </w:rPr>
+              <w:t>โปรแกรม​แจ้ง​เตือน​และ​ตรวจจับ​ความผิดปกติ</w:t>
+            </w:r>
+          </w:p>
+        </w:tc>
+        <w:tc>
+          <w:tcPr>
+            <w:tcW w:type="dxa" w:w="3969"/>
+          </w:tcPr>
+          <w:p>
+            <w:pPr>
+              <w:spacing w:after="0" w:line="240" w:lineRule="auto"/>
+            </w:pPr>
+            <w:r/>
+            <w:r>
+              <w:rPr>
+                <w:rFonts w:ascii="TH Sarabun New" w:hAnsi="TH Sarabun New" w:cs="TH Sarabun New" w:eastAsia="TH Sarabun New"/>
+                <w:b w:val="0"/>
+                <w:sz w:val="22"/>
+                <w:szCs w:val="22"/>
+                <w:lang w:bidi="th-TH"/>
+              </w:rPr>
+              <w:t>โปรแกรม​ที่​บ่งบอก​และ​ประเมิน​สุขภาพ</w:t>
+            </w:r>
+          </w:p>
+        </w:tc>
+      </w:tr>
+      <w:tr>
+        <w:tc>
+          <w:tcPr>
+            <w:tcW w:type="dxa" w:w="2041"/>
+          </w:tcPr>
+          <w:p>
+            <w:pPr>
+              <w:spacing w:after="0" w:line="240" w:lineRule="auto"/>
+            </w:pPr>
+            <w:r/>
+            <w:r>
+              <w:rPr>
+                <w:rFonts w:ascii="TH Sarabun New" w:hAnsi="TH Sarabun New" w:cs="TH Sarabun New" w:eastAsia="TH Sarabun New"/>
+                <w:b/>
+                <w:sz w:val="22"/>
+                <w:szCs w:val="22"/>
+                <w:bCs/>
+                <w:lang w:bidi="th-TH"/>
+              </w:rPr>
+              <w:t>ช่วย​ได้​ไหม</w:t>
+            </w:r>
+          </w:p>
+        </w:tc>
+        <w:tc>
+          <w:tcPr>
+            <w:tcW w:type="dxa" w:w="3969"/>
+          </w:tcPr>
+          <w:p>
+            <w:pPr>
+              <w:spacing w:after="0" w:line="240" w:lineRule="auto"/>
+            </w:pPr>
+            <w:r/>
+            <w:r>
+              <w:rPr>
+                <w:rFonts w:ascii="TH Sarabun New" w:hAnsi="TH Sarabun New" w:cs="TH Sarabun New" w:eastAsia="TH Sarabun New"/>
+                <w:b w:val="0"/>
+                <w:sz w:val="22"/>
+                <w:szCs w:val="22"/>
+                <w:lang w:bidi="th-TH"/>
+              </w:rPr>
+              <w:t>ยัง​ไม่​แน่ใจ</w:t>
+            </w:r>
+          </w:p>
+        </w:tc>
+        <w:tc>
+          <w:tcPr>
+            <w:tcW w:type="dxa" w:w="3969"/>
+          </w:tcPr>
+          <w:p>
+            <w:pPr>
+              <w:spacing w:after="0" w:line="240" w:lineRule="auto"/>
+            </w:pPr>
+            <w:r/>
+            <w:r>
+              <w:rPr>
+                <w:rFonts w:ascii="TH Sarabun New" w:hAnsi="TH Sarabun New" w:cs="TH Sarabun New" w:eastAsia="TH Sarabun New"/>
+                <w:b w:val="0"/>
+                <w:sz w:val="22"/>
+                <w:szCs w:val="22"/>
+                <w:lang w:bidi="th-TH"/>
+              </w:rPr>
+              <w:t>–</w:t>
+            </w:r>
+          </w:p>
+        </w:tc>
+      </w:tr>
+      <w:tr>
+        <w:tc>
+          <w:tcPr>
+            <w:tcW w:type="dxa" w:w="2041"/>
+          </w:tcPr>
+          <w:p>
+            <w:pPr>
+              <w:spacing w:after="0" w:line="240" w:lineRule="auto"/>
+            </w:pPr>
+            <w:r/>
+            <w:r>
+              <w:rPr>
+                <w:rFonts w:ascii="TH Sarabun New" w:hAnsi="TH Sarabun New" w:cs="TH Sarabun New" w:eastAsia="TH Sarabun New"/>
+                <w:b/>
+                <w:sz w:val="22"/>
+                <w:szCs w:val="22"/>
+                <w:bCs/>
+                <w:lang w:bidi="th-TH"/>
+              </w:rPr>
+              <w:t>ฟีเจอร์ 3 อันดับ</w:t>
+            </w:r>
+          </w:p>
+        </w:tc>
+        <w:tc>
+          <w:tcPr>
+            <w:tcW w:type="dxa" w:w="3969"/>
+          </w:tcPr>
+          <w:p>
+            <w:pPr>
+              <w:spacing w:after="0" w:line="240" w:lineRule="auto"/>
+            </w:pPr>
+            <w:r/>
+            <w:r>
+              <w:rPr>
+                <w:rFonts w:ascii="TH Sarabun New" w:hAnsi="TH Sarabun New" w:cs="TH Sarabun New" w:eastAsia="TH Sarabun New"/>
+                <w:b w:val="0"/>
+                <w:sz w:val="22"/>
+                <w:szCs w:val="22"/>
+                <w:lang w:bidi="th-TH"/>
+              </w:rPr>
+              <w:t>1. F2 รู้​ผล​ทันที​ว่า​เสี่ยง​ระดับ​ไหน พร้อม​เหตุผล  2. F7 ดู​ย้อนหลัง​ว่า​ดีขึ้น​หรือ​แย่​ลง  3. F1 ประเมิน​ความเสี่ยง​จาก​ที่​บ้าน​ผ่าน​กล้อง​มือถือ</w:t>
+            </w:r>
+          </w:p>
+        </w:tc>
+        <w:tc>
+          <w:tcPr>
+            <w:tcW w:type="dxa" w:w="3969"/>
+          </w:tcPr>
+          <w:p>
+            <w:pPr>
+              <w:spacing w:after="0" w:line="240" w:lineRule="auto"/>
+            </w:pPr>
+            <w:r/>
+            <w:r>
+              <w:rPr>
+                <w:rFonts w:ascii="TH Sarabun New" w:hAnsi="TH Sarabun New" w:cs="TH Sarabun New" w:eastAsia="TH Sarabun New"/>
+                <w:b w:val="0"/>
+                <w:sz w:val="22"/>
+                <w:szCs w:val="22"/>
+                <w:lang w:bidi="th-TH"/>
+              </w:rPr>
+              <w:t>1. F1 ประเมิน​ความเสี่ยง​จาก​ที่​บ้าน​ผ่าน​กล้อง​มือถือ  2. F2 รู้​ผล​ทันที​ว่า​เสี่ยง​ระดับ​ไหน พร้อม​เหตุผล  3. F7 ดู​ย้อนหลัง​ว่า​ดีขึ้น​หรือ​แย่​ลง</w:t>
+            </w:r>
+          </w:p>
+        </w:tc>
+      </w:tr>
+      <w:tr>
+        <w:tc>
+          <w:tcPr>
+            <w:tcW w:type="dxa" w:w="2041"/>
+          </w:tcPr>
+          <w:p>
+            <w:pPr>
+              <w:spacing w:after="0" w:line="240" w:lineRule="auto"/>
+            </w:pPr>
+            <w:r/>
+            <w:r>
+              <w:rPr>
+                <w:rFonts w:ascii="TH Sarabun New" w:hAnsi="TH Sarabun New" w:cs="TH Sarabun New" w:eastAsia="TH Sarabun New"/>
+                <w:b/>
+                <w:sz w:val="22"/>
+                <w:szCs w:val="22"/>
+                <w:bCs/>
+                <w:lang w:bidi="th-TH"/>
+              </w:rPr>
+              <w:t>เหตุผล / หมายเหตุ</w:t>
+            </w:r>
+          </w:p>
+        </w:tc>
+        <w:tc>
+          <w:tcPr>
+            <w:tcW w:type="dxa" w:w="3969"/>
+          </w:tcPr>
+          <w:p>
+            <w:pPr>
+              <w:spacing w:after="0" w:line="240" w:lineRule="auto"/>
+            </w:pPr>
+            <w:r/>
+            <w:r>
+              <w:rPr>
+                <w:rFonts w:ascii="TH Sarabun New" w:hAnsi="TH Sarabun New" w:cs="TH Sarabun New" w:eastAsia="TH Sarabun New"/>
+                <w:b w:val="0"/>
+                <w:sz w:val="22"/>
+                <w:szCs w:val="22"/>
+                <w:lang w:bidi="th-TH"/>
+              </w:rPr>
+              <w:t>–</w:t>
+            </w:r>
+          </w:p>
+        </w:tc>
+        <w:tc>
+          <w:tcPr>
+            <w:tcW w:type="dxa" w:w="3969"/>
+          </w:tcPr>
+          <w:p>
+            <w:pPr>
+              <w:spacing w:after="0" w:line="240" w:lineRule="auto"/>
+            </w:pPr>
+            <w:r/>
+            <w:r>
+              <w:rPr>
+                <w:rFonts w:ascii="TH Sarabun New" w:hAnsi="TH Sarabun New" w:cs="TH Sarabun New" w:eastAsia="TH Sarabun New"/>
+                <w:b w:val="0"/>
+                <w:sz w:val="22"/>
+                <w:szCs w:val="22"/>
+                <w:lang w:bidi="th-TH"/>
+              </w:rPr>
+              <w:t>คุณพ่อ​ไม่​ชอบ​ไปหา​หมอ​และ​ไม่​ชอบ​นั่ง​รอ · ดู​ย้อนหลัง​เหมือน​ได้​ตรวจสอบ · บอ​กว่า​อยาก​ได้การ​แจ้ง​ลูกหลาน​ด้วย</w:t>
+            </w:r>
+          </w:p>
+        </w:tc>
+      </w:tr>
+    </w:tbl>
     <w:p>
       <w:pPr>
-        <w:spacing w:after="0" w:line="240" w:lineRule="auto"/>
-        <w:ind w:left="170"/>
+        <w:spacing w:before="0" w:after="0" w:line="240" w:lineRule="auto"/>
       </w:pPr>
-      <w:r>
-        <w:rPr>
-          <w:rFonts w:ascii="TH Sarabun New" w:hAnsi="TH Sarabun New" w:cs="TH Sarabun New" w:eastAsia="TH Sarabun New"/>
-          <w:b/>
-          <w:color w:val="143A74"/>
-          <w:sz w:val="25"/>
-          <w:szCs w:val="25"/>
-          <w:bCs/>
-          <w:lang w:bidi="th-TH"/>
-        </w:rPr>
-        <w:t xml:space="preserve">•  </w:t>
-      </w:r>
-      <w:r>
-        <w:rPr>
-          <w:rFonts w:ascii="TH Sarabun New" w:hAnsi="TH Sarabun New" w:cs="TH Sarabun New" w:eastAsia="TH Sarabun New"/>
-          <w:b w:val="0"/>
-          <w:sz w:val="25"/>
-          <w:szCs w:val="25"/>
-          <w:lang w:bidi="th-TH"/>
-        </w:rPr>
-        <w:t>บางราย​เคย​หกล้ม​มากกว่า​ปี​ละ​ครั้ง บางราย​ประมาณ 3–4 ครั้ง​ต่อ​ปี</w:t>
-      </w:r>
-    </w:p>
-    <w:p>
-      <w:pPr>
-        <w:spacing w:after="0" w:line="240" w:lineRule="auto"/>
-        <w:ind w:left="170"/>
-      </w:pPr>
-      <w:r>
-        <w:rPr>
-          <w:rFonts w:ascii="TH Sarabun New" w:hAnsi="TH Sarabun New" w:cs="TH Sarabun New" w:eastAsia="TH Sarabun New"/>
-          <w:b/>
-          <w:color w:val="143A74"/>
-          <w:sz w:val="25"/>
-          <w:szCs w:val="25"/>
-          <w:bCs/>
-          <w:lang w:bidi="th-TH"/>
-        </w:rPr>
-        <w:t xml:space="preserve">•  </w:t>
-      </w:r>
-      <w:r>
-        <w:rPr>
-          <w:rFonts w:ascii="TH Sarabun New" w:hAnsi="TH Sarabun New" w:cs="TH Sarabun New" w:eastAsia="TH Sarabun New"/>
-          <w:b w:val="0"/>
-          <w:sz w:val="25"/>
-          <w:szCs w:val="25"/>
-          <w:lang w:bidi="th-TH"/>
-        </w:rPr>
-        <w:t>กังวล​เรื่อง​การ​หกล้ม การ​เจ็บป่วย และ​การล้ม​จน​กลายเป็น​ผู้ป่วย​ติด​เตียง</w:t>
-      </w:r>
-    </w:p>
-    <w:p>
-      <w:pPr>
-        <w:spacing w:after="0" w:line="240" w:lineRule="auto"/>
-        <w:ind w:left="170"/>
-      </w:pPr>
-      <w:r>
-        <w:rPr>
-          <w:rFonts w:ascii="TH Sarabun New" w:hAnsi="TH Sarabun New" w:cs="TH Sarabun New" w:eastAsia="TH Sarabun New"/>
-          <w:b/>
-          <w:color w:val="143A74"/>
-          <w:sz w:val="25"/>
-          <w:szCs w:val="25"/>
-          <w:bCs/>
-          <w:lang w:bidi="th-TH"/>
-        </w:rPr>
-        <w:t xml:space="preserve">•  </w:t>
-      </w:r>
-      <w:r>
-        <w:rPr>
-          <w:rFonts w:ascii="TH Sarabun New" w:hAnsi="TH Sarabun New" w:cs="TH Sarabun New" w:eastAsia="TH Sarabun New"/>
-          <w:b w:val="0"/>
-          <w:sz w:val="25"/>
-          <w:szCs w:val="25"/>
-          <w:lang w:bidi="th-TH"/>
-        </w:rPr>
-        <w:t>อย่าง​น้อย 1 ใน 3 คน​ไม่​เคย​ตรวจ​สุขภาพ​ประจำปี</w:t>
-      </w:r>
-    </w:p>
-    <w:p>
-      <w:pPr>
-        <w:spacing w:after="0" w:line="240" w:lineRule="auto"/>
-        <w:ind w:left="170"/>
-      </w:pPr>
-      <w:r>
-        <w:rPr>
-          <w:rFonts w:ascii="TH Sarabun New" w:hAnsi="TH Sarabun New" w:cs="TH Sarabun New" w:eastAsia="TH Sarabun New"/>
-          <w:b/>
-          <w:color w:val="143A74"/>
-          <w:sz w:val="25"/>
-          <w:szCs w:val="25"/>
-          <w:bCs/>
-          <w:lang w:bidi="th-TH"/>
-        </w:rPr>
-        <w:t xml:space="preserve">•  </w:t>
-      </w:r>
-      <w:r>
-        <w:rPr>
-          <w:rFonts w:ascii="TH Sarabun New" w:hAnsi="TH Sarabun New" w:cs="TH Sarabun New" w:eastAsia="TH Sarabun New"/>
-          <w:b w:val="0"/>
-          <w:sz w:val="25"/>
-          <w:szCs w:val="25"/>
-          <w:lang w:bidi="th-TH"/>
-        </w:rPr>
-        <w:t>หลาย​คน​ติดตั้ง​หรือ​จัดการ​แอ​ป​เอง​ไม่​ได้ ต้อง​ให้​ลูกหลาน​ช่วย</w:t>
-      </w:r>
-    </w:p>
-    <w:p>
-      <w:pPr>
-        <w:spacing w:after="0" w:line="240" w:lineRule="auto"/>
-        <w:ind w:left="170"/>
-      </w:pPr>
-      <w:r>
-        <w:rPr>
-          <w:rFonts w:ascii="TH Sarabun New" w:hAnsi="TH Sarabun New" w:cs="TH Sarabun New" w:eastAsia="TH Sarabun New"/>
-          <w:b/>
-          <w:color w:val="143A74"/>
-          <w:sz w:val="25"/>
-          <w:szCs w:val="25"/>
-          <w:bCs/>
-          <w:lang w:bidi="th-TH"/>
-        </w:rPr>
-        <w:t xml:space="preserve">•  </w:t>
-      </w:r>
-      <w:r>
-        <w:rPr>
-          <w:rFonts w:ascii="TH Sarabun New" w:hAnsi="TH Sarabun New" w:cs="TH Sarabun New" w:eastAsia="TH Sarabun New"/>
-          <w:b w:val="0"/>
-          <w:sz w:val="25"/>
-          <w:szCs w:val="25"/>
-          <w:lang w:bidi="th-TH"/>
-        </w:rPr>
-        <w:t>ต้องการ​ให้​แจ้ง​ลูกหลาน​เมื่อ​พบ​ความเสี่ยง​หรือ​เกิดเหตุ · ประเมิน​ได้​จาก​ที่​บ้าน · รู้​ผล​ทันที​ว่า​เสี่ยง​ระดับ​ไหน</w:t>
-      </w:r>
     </w:p>
     <w:p>
       <w:pPr>
@@ -1264,8 +2485,8 @@
           <w:rFonts w:ascii="TH Sarabun New" w:hAnsi="TH Sarabun New" w:cs="TH Sarabun New" w:eastAsia="TH Sarabun New"/>
           <w:b/>
           <w:color w:val="143A74"/>
-          <w:sz w:val="24"/>
-          <w:szCs w:val="24"/>
+          <w:sz w:val="23"/>
+          <w:szCs w:val="23"/>
           <w:bCs/>
           <w:lang w:bidi="th-TH"/>
         </w:rPr>
@@ -1275,8 +2496,8 @@
         <w:rPr>
           <w:rFonts w:ascii="TH Sarabun New" w:hAnsi="TH Sarabun New" w:cs="TH Sarabun New" w:eastAsia="TH Sarabun New"/>
           <w:b w:val="0"/>
-          <w:sz w:val="24"/>
-          <w:szCs w:val="24"/>
+          <w:sz w:val="23"/>
+          <w:szCs w:val="23"/>
           <w:lang w:bidi="th-TH"/>
         </w:rPr>
         <w:t>ตรวจร่างกาย​เอง​ที่​บ้าน​ด้วย​กล้อง​มือถือ ไม่ต้อง​เดินทาง​ไป​โรงพยาบาล</w:t>
@@ -1292,8 +2513,8 @@
           <w:rFonts w:ascii="TH Sarabun New" w:hAnsi="TH Sarabun New" w:cs="TH Sarabun New" w:eastAsia="TH Sarabun New"/>
           <w:b/>
           <w:color w:val="143A74"/>
-          <w:sz w:val="24"/>
-          <w:szCs w:val="24"/>
+          <w:sz w:val="23"/>
+          <w:szCs w:val="23"/>
           <w:bCs/>
           <w:lang w:bidi="th-TH"/>
         </w:rPr>
@@ -1303,8 +2524,8 @@
         <w:rPr>
           <w:rFonts w:ascii="TH Sarabun New" w:hAnsi="TH Sarabun New" w:cs="TH Sarabun New" w:eastAsia="TH Sarabun New"/>
           <w:b w:val="0"/>
-          <w:sz w:val="24"/>
-          <w:szCs w:val="24"/>
+          <w:sz w:val="23"/>
+          <w:szCs w:val="23"/>
           <w:lang w:bidi="th-TH"/>
         </w:rPr>
         <w:t>รู้​ผล​ทันที​ว่า​เสี่ยง​ล้ม​ระดับ​ไหน พร้อม​บอก​เหตุผล​ว่า​ทำไม</w:t>
@@ -1320,8 +2541,8 @@
           <w:rFonts w:ascii="TH Sarabun New" w:hAnsi="TH Sarabun New" w:cs="TH Sarabun New" w:eastAsia="TH Sarabun New"/>
           <w:b/>
           <w:color w:val="143A74"/>
-          <w:sz w:val="24"/>
-          <w:szCs w:val="24"/>
+          <w:sz w:val="23"/>
+          <w:szCs w:val="23"/>
           <w:bCs/>
           <w:lang w:bidi="th-TH"/>
         </w:rPr>
@@ -1331,8 +2552,8 @@
         <w:rPr>
           <w:rFonts w:ascii="TH Sarabun New" w:hAnsi="TH Sarabun New" w:cs="TH Sarabun New" w:eastAsia="TH Sarabun New"/>
           <w:b w:val="0"/>
-          <w:sz w:val="24"/>
-          <w:szCs w:val="24"/>
+          <w:sz w:val="23"/>
+          <w:szCs w:val="23"/>
           <w:lang w:bidi="th-TH"/>
         </w:rPr>
         <w:t>ลูกหลาน​ได้รับ​แจ้ง​เตือน​เมื่อ​ผล​แย่​ลง โดยที่​เรา​เป็น​คน​อนุญาต</w:t>
@@ -1348,8 +2569,8 @@
           <w:rFonts w:ascii="TH Sarabun New" w:hAnsi="TH Sarabun New" w:cs="TH Sarabun New" w:eastAsia="TH Sarabun New"/>
           <w:b/>
           <w:color w:val="143A74"/>
-          <w:sz w:val="24"/>
-          <w:szCs w:val="24"/>
+          <w:sz w:val="23"/>
+          <w:szCs w:val="23"/>
           <w:bCs/>
           <w:lang w:bidi="th-TH"/>
         </w:rPr>
@@ -1359,8 +2580,8 @@
         <w:rPr>
           <w:rFonts w:ascii="TH Sarabun New" w:hAnsi="TH Sarabun New" w:cs="TH Sarabun New" w:eastAsia="TH Sarabun New"/>
           <w:b w:val="0"/>
-          <w:sz w:val="24"/>
-          <w:szCs w:val="24"/>
+          <w:sz w:val="23"/>
+          <w:szCs w:val="23"/>
           <w:lang w:bidi="th-TH"/>
         </w:rPr>
         <w:t>มี​เจ้าหน้าที่​โทร​กลับ​ภายใน 1–3 วัน​เมื่อ​ระบบ​พบ​สัญญาณ​เสี่ยง</w:t>
@@ -1376,8 +2597,8 @@
           <w:rFonts w:ascii="TH Sarabun New" w:hAnsi="TH Sarabun New" w:cs="TH Sarabun New" w:eastAsia="TH Sarabun New"/>
           <w:b/>
           <w:color w:val="143A74"/>
-          <w:sz w:val="24"/>
-          <w:szCs w:val="24"/>
+          <w:sz w:val="23"/>
+          <w:szCs w:val="23"/>
           <w:bCs/>
           <w:lang w:bidi="th-TH"/>
         </w:rPr>
@@ -1387,8 +2608,8 @@
         <w:rPr>
           <w:rFonts w:ascii="TH Sarabun New" w:hAnsi="TH Sarabun New" w:cs="TH Sarabun New" w:eastAsia="TH Sarabun New"/>
           <w:b w:val="0"/>
-          <w:sz w:val="24"/>
-          <w:szCs w:val="24"/>
+          <w:sz w:val="23"/>
+          <w:szCs w:val="23"/>
           <w:lang w:bidi="th-TH"/>
         </w:rPr>
         <w:t>เภสัชกรช่วยดูว่ายาที่กินอยู่ตัวไหนทำให้เวียนหัวหรือเสี่ยงล้ม</w:t>
@@ -1404,8 +2625,8 @@
           <w:rFonts w:ascii="TH Sarabun New" w:hAnsi="TH Sarabun New" w:cs="TH Sarabun New" w:eastAsia="TH Sarabun New"/>
           <w:b/>
           <w:color w:val="143A74"/>
-          <w:sz w:val="24"/>
-          <w:szCs w:val="24"/>
+          <w:sz w:val="23"/>
+          <w:szCs w:val="23"/>
           <w:bCs/>
           <w:lang w:bidi="th-TH"/>
         </w:rPr>
@@ -1415,8 +2636,8 @@
         <w:rPr>
           <w:rFonts w:ascii="TH Sarabun New" w:hAnsi="TH Sarabun New" w:cs="TH Sarabun New" w:eastAsia="TH Sarabun New"/>
           <w:b w:val="0"/>
-          <w:sz w:val="24"/>
-          <w:szCs w:val="24"/>
+          <w:sz w:val="23"/>
+          <w:szCs w:val="23"/>
           <w:lang w:bidi="th-TH"/>
         </w:rPr>
         <w:t>ส่งต่อนักกายภาพบำบัดพร้อมข้อมูล ไม่ต้อง​เล่าเรื่อง​ใหม่​ตั้ง​แต่ต้น</w:t>
@@ -1432,8 +2653,8 @@
           <w:rFonts w:ascii="TH Sarabun New" w:hAnsi="TH Sarabun New" w:cs="TH Sarabun New" w:eastAsia="TH Sarabun New"/>
           <w:b/>
           <w:color w:val="143A74"/>
-          <w:sz w:val="24"/>
-          <w:szCs w:val="24"/>
+          <w:sz w:val="23"/>
+          <w:szCs w:val="23"/>
           <w:bCs/>
           <w:lang w:bidi="th-TH"/>
         </w:rPr>
@@ -1443,8 +2664,8 @@
         <w:rPr>
           <w:rFonts w:ascii="TH Sarabun New" w:hAnsi="TH Sarabun New" w:cs="TH Sarabun New" w:eastAsia="TH Sarabun New"/>
           <w:b w:val="0"/>
-          <w:sz w:val="24"/>
-          <w:szCs w:val="24"/>
+          <w:sz w:val="23"/>
+          <w:szCs w:val="23"/>
           <w:lang w:bidi="th-TH"/>
         </w:rPr>
         <w:t>ดู​ย้อนหลัง​ได้​ว่า​เดือน​นี้​ดีขึ้น​หรือ​แย่​ลง​กว่า​ครั้งก่อน</w:t>
@@ -1460,8 +2681,8 @@
           <w:rFonts w:ascii="TH Sarabun New" w:hAnsi="TH Sarabun New" w:cs="TH Sarabun New" w:eastAsia="TH Sarabun New"/>
           <w:b/>
           <w:color w:val="143A74"/>
-          <w:sz w:val="24"/>
-          <w:szCs w:val="24"/>
+          <w:sz w:val="23"/>
+          <w:szCs w:val="23"/>
           <w:bCs/>
           <w:lang w:bidi="th-TH"/>
         </w:rPr>
@@ -1471,38 +2692,17 @@
         <w:rPr>
           <w:rFonts w:ascii="TH Sarabun New" w:hAnsi="TH Sarabun New" w:cs="TH Sarabun New" w:eastAsia="TH Sarabun New"/>
           <w:b w:val="0"/>
-          <w:sz w:val="24"/>
-          <w:szCs w:val="24"/>
+          <w:sz w:val="23"/>
+          <w:szCs w:val="23"/>
           <w:lang w:bidi="th-TH"/>
         </w:rPr>
         <w:t>ภาพ​จาก​กล้อง​ไม่​ออกจาก​เครื่อง และ​ลบ​ข้อมูล​ตัวเอง​ได้​ทุกเมื่อ</w:t>
       </w:r>
     </w:p>
-    <w:p>
-      <w:pPr>
-        <w:spacing w:before="0" w:after="40" w:line="240" w:lineRule="auto"/>
-      </w:pPr>
-    </w:p>
-    <w:p>
-      <w:pPr>
-        <w:spacing w:before="0" w:after="0" w:line="240" w:lineRule="auto"/>
-      </w:pPr>
-      <w:r>
-        <w:rPr>
-          <w:rFonts w:ascii="TH Sarabun New" w:hAnsi="TH Sarabun New" w:cs="TH Sarabun New" w:eastAsia="TH Sarabun New"/>
-          <w:b w:val="0"/>
-          <w:color w:val="4F5F78"/>
-          <w:sz w:val="23"/>
-          <w:szCs w:val="23"/>
-          <w:lang w:bidi="th-TH"/>
-        </w:rPr>
-        <w:t>R01 ตอบ​แบบสอบถาม​ด้วย​ตนเอง​หลัง​อ่าน​ใบ​อธิบาย​โปรแกรม · R02 สัมภาษณ์​ตัวต่อตัว​โดย​หัวหน้า​ทีม หลัง​อธิบาย​โปรแกรม​และ​ให้​อ่าน​ใบ​อธิบาย</w:t>
-      </w:r>
-    </w:p>
     <w:sectPr>
       <w:footerReference w:type="default" r:id="rId9"/>
       <w:pgSz w:w="11906" w:h="16838"/>
-      <w:pgMar w:top="680" w:right="1020" w:bottom="567" w:left="1020" w:header="720" w:footer="255" w:gutter="0"/>
+      <w:pgMar w:top="624" w:right="964" w:bottom="510" w:left="964" w:header="720" w:footer="227" w:gutter="0"/>
       <w:cols w:space="720"/>
       <w:docGrid w:linePitch="360"/>
     </w:sectPr>
@@ -1526,7 +2726,7 @@
         <w:szCs w:val="20"/>
         <w:lang w:bidi="th-TH"/>
       </w:rPr>
-      <w:t>ภาคผนวก · ข้อมูลผู้ให้ข้อมูลที่ถอดจากแบบสอบถามและการสัมภาษณ์ · รหัสแทนชื่อจริง</w:t>
+      <w:t>ภาคผนวก · ข้อมูลผู้ให้ข้อมูลที่ถอดจากเสียงสัมภาษณ์และแบบสอบถาม · รหัสแทนชื่อจริง</w:t>
     </w:r>
   </w:p>
 </w:ftr>
@@ -1897,7 +3097,7 @@
     <w:rsid w:val="00FC693F"/>
     <w:rPr>
       <w:rFonts w:ascii="TH Sarabun New" w:hAnsi="TH Sarabun New" w:cs="TH Sarabun New" w:eastAsia="TH Sarabun New"/>
-      <w:sz w:val="26"/>
+      <w:sz w:val="25"/>
     </w:rPr>
   </w:style>
   <w:style w:type="paragraph" w:styleId="Header">

</xml_diff>